<commit_message>
feat(sow): add Digital ID Version, Identifier, SSO fields to PrivyPass form
- Digital ID Version (required, default V1): single select V1/V2
- Identifier (optional, visible only when V2): multiselect Phone/PrivyID/NIK/Email, default all
- SSO (optional, visible only when V2): single select Enabled/Disabled, default Disabled
- When V1 selected, Identifier and SSO auto-reset and render as "-" in docx
- Update template_privypass.docx with {{ digitalid_version }}, {{ identifier }}, {{ sso }}
- Update backend context mapping and document preview table
</commit_message>
<xml_diff>
--- a/apps/sow-generator/backend/template_privypass.docx
+++ b/apps/sow-generator/backend/template_privypass.docx
@@ -1,6 +1,6 @@
 
 <file path=word/document.xml><?xml version="1.0" encoding="utf-8"?>
-<w:document xmlns:wpc="http://schemas.microsoft.com/office/word/2010/wordprocessingCanvas" xmlns:mc="http://schemas.openxmlformats.org/markup-compatibility/2006" xmlns:o="urn:schemas-microsoft-com:office:office" xmlns:r="http://schemas.openxmlformats.org/officeDocument/2006/relationships" xmlns:m="http://schemas.openxmlformats.org/officeDocument/2006/math" xmlns:v="urn:schemas-microsoft-com:vml" xmlns:wp14="http://schemas.microsoft.com/office/word/2010/wordprocessingDrawing" xmlns:wp="http://schemas.openxmlformats.org/drawingml/2006/wordprocessingDrawing" xmlns:w="http://schemas.openxmlformats.org/wordprocessingml/2006/main" xmlns:w14="http://schemas.microsoft.com/office/word/2010/wordml" xmlns:w10="urn:schemas-microsoft-com:office:word" xmlns:w15="http://schemas.microsoft.com/office/word/2012/wordml" xmlns:wpg="http://schemas.microsoft.com/office/word/2010/wordprocessingGroup" xmlns:wpi="http://schemas.microsoft.com/office/word/2010/wordprocessingInk" xmlns:wne="http://schemas.microsoft.com/office/word/2006/wordml" xmlns:wps="http://schemas.microsoft.com/office/word/2010/wordprocessingShape" xmlns:wpsCustomData="http://www.wps.cn/officeDocument/2013/wpsCustomData" mc:Ignorable="w14 w15 wp14">
+<w:document xmlns:wpc="http://schemas.microsoft.com/office/word/2010/wordprocessingCanvas" xmlns:cx="http://schemas.microsoft.com/office/drawing/2014/chartex" xmlns:cx1="http://schemas.microsoft.com/office/drawing/2015/9/8/chartex" xmlns:cx2="http://schemas.microsoft.com/office/drawing/2015/10/21/chartex" xmlns:cx3="http://schemas.microsoft.com/office/drawing/2016/5/9/chartex" xmlns:cx4="http://schemas.microsoft.com/office/drawing/2016/5/10/chartex" xmlns:cx5="http://schemas.microsoft.com/office/drawing/2016/5/11/chartex" xmlns:cx6="http://schemas.microsoft.com/office/drawing/2016/5/12/chartex" xmlns:cx7="http://schemas.microsoft.com/office/drawing/2016/5/13/chartex" xmlns:cx8="http://schemas.microsoft.com/office/drawing/2016/5/14/chartex" xmlns:mc="http://schemas.openxmlformats.org/markup-compatibility/2006" xmlns:o="urn:schemas-microsoft-com:office:office" xmlns:r="http://schemas.openxmlformats.org/officeDocument/2006/relationships" xmlns:m="http://schemas.openxmlformats.org/officeDocument/2006/math" xmlns:v="urn:schemas-microsoft-com:vml" xmlns:wp14="http://schemas.microsoft.com/office/word/2010/wordprocessingDrawing" xmlns:wp="http://schemas.openxmlformats.org/drawingml/2006/wordprocessingDrawing" xmlns:w="http://schemas.openxmlformats.org/wordprocessingml/2006/main" xmlns:w14="http://schemas.microsoft.com/office/word/2010/wordml" xmlns:w10="urn:schemas-microsoft-com:office:word" xmlns:w15="http://schemas.microsoft.com/office/word/2012/wordml" xmlns:wpg="http://schemas.microsoft.com/office/word/2010/wordprocessingGroup" xmlns:wpi="http://schemas.microsoft.com/office/word/2010/wordprocessingInk" xmlns:wne="http://schemas.microsoft.com/office/word/2006/wordml" xmlns:wps="http://schemas.microsoft.com/office/word/2010/wordprocessingShape" xmlns:wpsCustomData="http://www.wps.cn/officeDocument/2013/wpsCustomData" mc:Ignorable="w14 w15 wp14">
   <w:body>
     <w:p>
       <w:pPr>
@@ -2849,12 +2849,14 @@
         <w:tc>
           <w:tcPr>
             <w:tcW w:w="2542" w:type="dxa"/>
+            <w:vAlign w:val="center"/>
           </w:tcPr>
           <w:p>
             <w:pPr>
               <w:pStyle w:val="21"/>
               <w:spacing w:line="360" w:lineRule="auto"/>
               <w:ind w:left="122"/>
+              <w:jc w:val="left"/>
               <w:rPr>
                 <w:rFonts w:ascii="Calibri" w:hAnsi="Calibri" w:cs="Calibri"/>
                 <w:sz w:val="24"/>
@@ -2874,11 +2876,13 @@
         <w:tc>
           <w:tcPr>
             <w:tcW w:w="3260" w:type="dxa"/>
+            <w:vAlign w:val="center"/>
           </w:tcPr>
           <w:p>
             <w:pPr>
               <w:pStyle w:val="21"/>
               <w:spacing w:line="360" w:lineRule="auto"/>
+              <w:jc w:val="left"/>
               <w:rPr>
                 <w:rFonts w:hint="default" w:ascii="Calibri" w:hAnsi="Calibri" w:cs="Calibri"/>
                 <w:b/>
@@ -2910,12 +2914,13 @@
         <w:tc>
           <w:tcPr>
             <w:tcW w:w="4101" w:type="dxa"/>
+            <w:vAlign w:val="center"/>
           </w:tcPr>
           <w:p>
             <w:pPr>
               <w:spacing w:line="360" w:lineRule="auto"/>
               <w:ind w:left="138" w:right="119"/>
-              <w:jc w:val="both"/>
+              <w:jc w:val="left"/>
               <w:rPr>
                 <w:rFonts w:ascii="Calibri" w:hAnsi="Calibri" w:cs="Calibri"/>
                 <w:sz w:val="24"/>
@@ -2940,7 +2945,7 @@
               </w:numPr>
               <w:spacing w:line="360" w:lineRule="auto"/>
               <w:ind w:right="119"/>
-              <w:jc w:val="both"/>
+              <w:jc w:val="left"/>
               <w:rPr>
                 <w:rFonts w:ascii="Calibri" w:hAnsi="Calibri" w:cs="Calibri"/>
                 <w:sz w:val="24"/>
@@ -2965,7 +2970,7 @@
               </w:numPr>
               <w:spacing w:line="360" w:lineRule="auto"/>
               <w:ind w:right="119"/>
-              <w:jc w:val="both"/>
+              <w:jc w:val="left"/>
               <w:rPr>
                 <w:rFonts w:ascii="Calibri" w:hAnsi="Calibri" w:cs="Calibri"/>
                 <w:sz w:val="24"/>
@@ -2985,7 +2990,7 @@
             <w:pPr>
               <w:spacing w:line="360" w:lineRule="auto"/>
               <w:ind w:left="138" w:right="119"/>
-              <w:jc w:val="both"/>
+              <w:jc w:val="left"/>
               <w:rPr>
                 <w:rFonts w:ascii="Calibri" w:hAnsi="Calibri" w:cs="Calibri"/>
                 <w:sz w:val="24"/>
@@ -3009,6 +3014,537 @@
                 <w:szCs w:val="24"/>
               </w:rPr>
               <w:t xml:space="preserve"> If choose purchase, user who has freemium will be blocked.</w:t>
+            </w:r>
+          </w:p>
+        </w:tc>
+      </w:tr>
+      <w:tr>
+        <w:trPr>
+          <w:cantSplit/>
+          <w:trHeight w:val="859" w:hRule="atLeast"/>
+        </w:trPr>
+        <w:tc>
+          <w:tcPr>
+            <w:tcW w:w="2542" w:type="dxa"/>
+            <w:vAlign w:val="center"/>
+          </w:tcPr>
+          <w:p>
+            <w:pPr>
+              <w:pStyle w:val="21"/>
+              <w:spacing w:line="360" w:lineRule="auto"/>
+              <w:ind w:left="122"/>
+              <w:jc w:val="left"/>
+              <w:rPr>
+                <w:rFonts w:hint="default" w:ascii="Calibri" w:hAnsi="Calibri" w:cs="Calibri"/>
+                <w:sz w:val="24"/>
+                <w:szCs w:val="24"/>
+                <w:lang w:val="en-US"/>
+              </w:rPr>
+            </w:pPr>
+            <w:r>
+              <w:rPr>
+                <w:rFonts w:hint="default" w:ascii="Calibri" w:hAnsi="Calibri" w:cs="Calibri"/>
+                <w:sz w:val="24"/>
+                <w:szCs w:val="24"/>
+                <w:lang w:val="en-US"/>
+              </w:rPr>
+              <w:t>Digital ID Version</w:t>
+            </w:r>
+          </w:p>
+        </w:tc>
+        <w:tc>
+          <w:tcPr>
+            <w:tcW w:w="3260" w:type="dxa"/>
+            <w:vAlign w:val="center"/>
+          </w:tcPr>
+          <w:p>
+            <w:pPr>
+              <w:pStyle w:val="21"/>
+              <w:spacing w:line="360" w:lineRule="auto"/>
+              <w:jc w:val="left"/>
+              <w:rPr>
+                <w:rFonts w:hint="default" w:ascii="Calibri" w:hAnsi="Calibri" w:cs="Calibri"/>
+                <w:sz w:val="24"/>
+                <w:szCs w:val="24"/>
+                <w:lang w:val="en-US"/>
+              </w:rPr>
+            </w:pPr>
+            <w:r>
+              <w:rPr>
+                <w:rFonts w:hint="default" w:ascii="Calibri" w:hAnsi="Calibri" w:cs="Calibri"/>
+                <w:sz w:val="24"/>
+                <w:szCs w:val="24"/>
+                <w:lang w:val="en-US"/>
+              </w:rPr>
+              <w:t xml:space="preserve"> {{ digitalid_version }}</w:t>
+            </w:r>
+          </w:p>
+        </w:tc>
+        <w:tc>
+          <w:tcPr>
+            <w:tcW w:w="4101" w:type="dxa"/>
+            <w:vAlign w:val="center"/>
+          </w:tcPr>
+          <w:p>
+            <w:pPr>
+              <w:spacing w:line="360" w:lineRule="auto"/>
+              <w:ind w:left="138" w:right="119"/>
+              <w:jc w:val="left"/>
+              <w:rPr>
+                <w:rFonts w:hint="default" w:ascii="Calibri" w:hAnsi="Calibri" w:cs="Calibri"/>
+                <w:b w:val="0"/>
+                <w:bCs w:val="0"/>
+                <w:sz w:val="24"/>
+                <w:szCs w:val="24"/>
+              </w:rPr>
+            </w:pPr>
+            <w:r>
+              <w:rPr>
+                <w:rFonts w:hint="default" w:ascii="Calibri" w:hAnsi="Calibri" w:cs="Calibri"/>
+                <w:b w:val="0"/>
+                <w:bCs w:val="0"/>
+                <w:sz w:val="24"/>
+                <w:szCs w:val="24"/>
+              </w:rPr>
+              <w:t>Version of Digital ID</w:t>
+            </w:r>
+          </w:p>
+          <w:p>
+            <w:pPr>
+              <w:pStyle w:val="3"/>
+              <w:numPr>
+                <w:ilvl w:val="0"/>
+                <w:numId w:val="2"/>
+              </w:numPr>
+              <w:spacing w:line="360" w:lineRule="auto"/>
+              <w:ind w:right="119"/>
+              <w:jc w:val="left"/>
+              <w:rPr>
+                <w:rFonts w:ascii="Calibri" w:hAnsi="Calibri" w:cs="Calibri"/>
+                <w:sz w:val="24"/>
+                <w:szCs w:val="24"/>
+              </w:rPr>
+            </w:pPr>
+            <w:r>
+              <w:rPr>
+                <w:rFonts w:hint="default" w:ascii="Calibri" w:hAnsi="Calibri" w:cs="Calibri"/>
+                <w:sz w:val="24"/>
+                <w:szCs w:val="24"/>
+                <w:lang w:val="en-US"/>
+              </w:rPr>
+              <w:t>V1 (Redirect Privy Apps)</w:t>
+            </w:r>
+          </w:p>
+          <w:p>
+            <w:pPr>
+              <w:pStyle w:val="3"/>
+              <w:numPr>
+                <w:ilvl w:val="0"/>
+                <w:numId w:val="2"/>
+              </w:numPr>
+              <w:spacing w:line="360" w:lineRule="auto"/>
+              <w:ind w:right="119"/>
+              <w:jc w:val="left"/>
+              <w:rPr>
+                <w:rFonts w:ascii="Calibri" w:hAnsi="Calibri" w:cs="Calibri"/>
+                <w:b w:val="0"/>
+                <w:bCs w:val="0"/>
+                <w:sz w:val="24"/>
+                <w:szCs w:val="24"/>
+              </w:rPr>
+            </w:pPr>
+            <w:r>
+              <w:rPr>
+                <w:rFonts w:hint="default" w:ascii="Calibri" w:hAnsi="Calibri" w:cs="Calibri"/>
+                <w:sz w:val="24"/>
+                <w:szCs w:val="24"/>
+                <w:lang w:val="en-US"/>
+              </w:rPr>
+              <w:t>V2 (Non Redirect)</w:t>
+            </w:r>
+          </w:p>
+        </w:tc>
+      </w:tr>
+      <w:tr>
+        <w:trPr>
+          <w:cantSplit/>
+          <w:trHeight w:val="859" w:hRule="atLeast"/>
+        </w:trPr>
+        <w:tc>
+          <w:tcPr>
+            <w:tcW w:w="2542" w:type="dxa"/>
+            <w:vAlign w:val="center"/>
+          </w:tcPr>
+          <w:p>
+            <w:pPr>
+              <w:pStyle w:val="21"/>
+              <w:spacing w:line="360" w:lineRule="auto"/>
+              <w:ind w:left="122"/>
+              <w:jc w:val="left"/>
+              <w:rPr>
+                <w:rFonts w:hint="default" w:ascii="Calibri" w:hAnsi="Calibri" w:cs="Calibri"/>
+                <w:sz w:val="24"/>
+                <w:szCs w:val="24"/>
+                <w:lang w:val="en-US"/>
+              </w:rPr>
+            </w:pPr>
+            <w:r>
+              <w:rPr>
+                <w:rFonts w:hint="default" w:ascii="Calibri" w:hAnsi="Calibri" w:cs="Calibri"/>
+                <w:sz w:val="24"/>
+                <w:szCs w:val="24"/>
+                <w:lang w:val="en-US"/>
+              </w:rPr>
+              <w:t>Identifier</w:t>
+            </w:r>
+          </w:p>
+        </w:tc>
+        <w:tc>
+          <w:tcPr>
+            <w:tcW w:w="3260" w:type="dxa"/>
+            <w:vAlign w:val="center"/>
+          </w:tcPr>
+          <w:p>
+            <w:pPr>
+              <w:pStyle w:val="21"/>
+              <w:spacing w:line="360" w:lineRule="auto"/>
+              <w:jc w:val="left"/>
+              <w:rPr>
+                <w:rFonts w:hint="default" w:ascii="Calibri" w:hAnsi="Calibri" w:cs="Calibri"/>
+                <w:sz w:val="24"/>
+                <w:szCs w:val="24"/>
+                <w:lang w:val="en-US"/>
+              </w:rPr>
+            </w:pPr>
+            <w:r>
+              <w:rPr>
+                <w:rFonts w:hint="default" w:ascii="Calibri" w:hAnsi="Calibri" w:cs="Calibri"/>
+                <w:sz w:val="24"/>
+                <w:szCs w:val="24"/>
+                <w:lang w:val="en-US"/>
+              </w:rPr>
+              <w:t xml:space="preserve"> {{ identifier }}</w:t>
+            </w:r>
+          </w:p>
+        </w:tc>
+        <w:tc>
+          <w:tcPr>
+            <w:tcW w:w="4101" w:type="dxa"/>
+            <w:vAlign w:val="center"/>
+          </w:tcPr>
+          <w:p>
+            <w:pPr>
+              <w:spacing w:line="360" w:lineRule="auto"/>
+              <w:ind w:left="138" w:right="119"/>
+              <w:jc w:val="left"/>
+              <w:rPr>
+                <w:rFonts w:hint="default" w:ascii="Calibri" w:hAnsi="Calibri" w:cs="Calibri"/>
+                <w:b w:val="0"/>
+                <w:bCs w:val="0"/>
+                <w:sz w:val="24"/>
+                <w:szCs w:val="24"/>
+                <w:lang w:val="en-US"/>
+              </w:rPr>
+            </w:pPr>
+            <w:r>
+              <w:rPr>
+                <w:rFonts w:hint="default" w:ascii="Calibri" w:hAnsi="Calibri" w:cs="Calibri"/>
+                <w:b w:val="0"/>
+                <w:bCs w:val="0"/>
+                <w:sz w:val="24"/>
+                <w:szCs w:val="24"/>
+                <w:lang w:val="en-US"/>
+              </w:rPr>
+              <w:t>First data identifier by user</w:t>
+            </w:r>
+          </w:p>
+          <w:p>
+            <w:pPr>
+              <w:pStyle w:val="3"/>
+              <w:numPr>
+                <w:ilvl w:val="0"/>
+                <w:numId w:val="2"/>
+              </w:numPr>
+              <w:spacing w:line="360" w:lineRule="auto"/>
+              <w:ind w:right="119"/>
+              <w:jc w:val="left"/>
+              <w:rPr>
+                <w:rFonts w:ascii="Calibri" w:hAnsi="Calibri" w:cs="Calibri"/>
+                <w:b w:val="0"/>
+                <w:bCs w:val="0"/>
+                <w:sz w:val="24"/>
+                <w:szCs w:val="24"/>
+              </w:rPr>
+            </w:pPr>
+            <w:r>
+              <w:rPr>
+                <w:rFonts w:hint="default" w:ascii="Calibri" w:hAnsi="Calibri" w:cs="Calibri"/>
+                <w:b w:val="0"/>
+                <w:bCs w:val="0"/>
+                <w:sz w:val="24"/>
+                <w:szCs w:val="24"/>
+                <w:lang w:val="en-US"/>
+              </w:rPr>
+              <w:t>Phone</w:t>
+            </w:r>
+          </w:p>
+          <w:p>
+            <w:pPr>
+              <w:pStyle w:val="3"/>
+              <w:numPr>
+                <w:ilvl w:val="0"/>
+                <w:numId w:val="2"/>
+              </w:numPr>
+              <w:spacing w:line="360" w:lineRule="auto"/>
+              <w:ind w:right="119"/>
+              <w:jc w:val="left"/>
+              <w:rPr>
+                <w:rFonts w:ascii="Calibri" w:hAnsi="Calibri" w:cs="Calibri"/>
+                <w:b w:val="0"/>
+                <w:bCs w:val="0"/>
+                <w:sz w:val="24"/>
+                <w:szCs w:val="24"/>
+              </w:rPr>
+            </w:pPr>
+            <w:r>
+              <w:rPr>
+                <w:rFonts w:hint="default" w:ascii="Calibri" w:hAnsi="Calibri" w:cs="Calibri"/>
+                <w:b w:val="0"/>
+                <w:bCs w:val="0"/>
+                <w:sz w:val="24"/>
+                <w:szCs w:val="24"/>
+                <w:lang w:val="en-US"/>
+              </w:rPr>
+              <w:t>PrivyID</w:t>
+            </w:r>
+          </w:p>
+          <w:p>
+            <w:pPr>
+              <w:pStyle w:val="3"/>
+              <w:numPr>
+                <w:ilvl w:val="0"/>
+                <w:numId w:val="2"/>
+              </w:numPr>
+              <w:spacing w:line="360" w:lineRule="auto"/>
+              <w:ind w:right="119"/>
+              <w:jc w:val="left"/>
+              <w:rPr>
+                <w:rFonts w:ascii="Calibri" w:hAnsi="Calibri" w:cs="Calibri"/>
+                <w:b w:val="0"/>
+                <w:bCs w:val="0"/>
+                <w:sz w:val="24"/>
+                <w:szCs w:val="24"/>
+              </w:rPr>
+            </w:pPr>
+            <w:r>
+              <w:rPr>
+                <w:rFonts w:hint="default" w:ascii="Calibri" w:hAnsi="Calibri" w:cs="Calibri"/>
+                <w:b w:val="0"/>
+                <w:bCs w:val="0"/>
+                <w:sz w:val="24"/>
+                <w:szCs w:val="24"/>
+                <w:lang w:val="en-US"/>
+              </w:rPr>
+              <w:t>NIK</w:t>
+            </w:r>
+          </w:p>
+          <w:p>
+            <w:pPr>
+              <w:pStyle w:val="3"/>
+              <w:numPr>
+                <w:ilvl w:val="0"/>
+                <w:numId w:val="2"/>
+              </w:numPr>
+              <w:spacing w:line="360" w:lineRule="auto"/>
+              <w:ind w:right="119"/>
+              <w:jc w:val="left"/>
+              <w:rPr>
+                <w:rFonts w:ascii="Calibri" w:hAnsi="Calibri" w:cs="Calibri"/>
+                <w:b w:val="0"/>
+                <w:bCs w:val="0"/>
+                <w:sz w:val="24"/>
+                <w:szCs w:val="24"/>
+              </w:rPr>
+            </w:pPr>
+            <w:r>
+              <w:rPr>
+                <w:rFonts w:hint="default" w:ascii="Calibri" w:hAnsi="Calibri" w:cs="Calibri"/>
+                <w:b w:val="0"/>
+                <w:bCs w:val="0"/>
+                <w:sz w:val="24"/>
+                <w:szCs w:val="24"/>
+                <w:lang w:val="en-US"/>
+              </w:rPr>
+              <w:t>Email</w:t>
+            </w:r>
+          </w:p>
+        </w:tc>
+      </w:tr>
+      <w:tr>
+        <w:trPr>
+          <w:cantSplit/>
+          <w:trHeight w:val="859" w:hRule="atLeast"/>
+        </w:trPr>
+        <w:tc>
+          <w:tcPr>
+            <w:tcW w:w="2542" w:type="dxa"/>
+            <w:vAlign w:val="center"/>
+          </w:tcPr>
+          <w:p>
+            <w:pPr>
+              <w:pStyle w:val="21"/>
+              <w:spacing w:line="360" w:lineRule="auto"/>
+              <w:ind w:left="122"/>
+              <w:jc w:val="left"/>
+              <w:rPr>
+                <w:rFonts w:hint="default" w:ascii="Calibri" w:hAnsi="Calibri" w:cs="Calibri"/>
+                <w:sz w:val="24"/>
+                <w:szCs w:val="24"/>
+                <w:lang w:val="en-US"/>
+              </w:rPr>
+            </w:pPr>
+            <w:r>
+              <w:rPr>
+                <w:rFonts w:hint="default" w:ascii="Calibri" w:hAnsi="Calibri" w:cs="Calibri"/>
+                <w:sz w:val="24"/>
+                <w:szCs w:val="24"/>
+                <w:lang w:val="en-US"/>
+              </w:rPr>
+              <w:t>SSO</w:t>
+            </w:r>
+          </w:p>
+        </w:tc>
+        <w:tc>
+          <w:tcPr>
+            <w:tcW w:w="3260" w:type="dxa"/>
+            <w:vAlign w:val="center"/>
+          </w:tcPr>
+          <w:p>
+            <w:pPr>
+              <w:pStyle w:val="21"/>
+              <w:spacing w:line="360" w:lineRule="auto"/>
+              <w:jc w:val="left"/>
+              <w:rPr>
+                <w:rFonts w:hint="default" w:ascii="Calibri" w:hAnsi="Calibri" w:cs="Calibri"/>
+                <w:sz w:val="24"/>
+                <w:szCs w:val="24"/>
+                <w:lang w:val="en-US"/>
+              </w:rPr>
+            </w:pPr>
+            <w:r>
+              <w:rPr>
+                <w:rFonts w:hint="default" w:ascii="Calibri" w:hAnsi="Calibri" w:cs="Calibri"/>
+                <w:sz w:val="24"/>
+                <w:szCs w:val="24"/>
+                <w:lang w:val="en-US"/>
+              </w:rPr>
+              <w:t xml:space="preserve"> {{ sso }}</w:t>
+            </w:r>
+          </w:p>
+        </w:tc>
+        <w:tc>
+          <w:tcPr>
+            <w:tcW w:w="4101" w:type="dxa"/>
+            <w:vAlign w:val="center"/>
+          </w:tcPr>
+          <w:p>
+            <w:pPr>
+              <w:spacing w:line="360" w:lineRule="auto"/>
+              <w:ind w:left="138" w:right="119"/>
+              <w:jc w:val="left"/>
+              <w:rPr>
+                <w:rFonts w:hint="default" w:ascii="Calibri" w:hAnsi="Calibri" w:cs="Calibri"/>
+                <w:b w:val="0"/>
+                <w:bCs w:val="0"/>
+                <w:sz w:val="24"/>
+                <w:szCs w:val="24"/>
+                <w:lang w:val="en-US"/>
+              </w:rPr>
+            </w:pPr>
+            <w:r>
+              <w:rPr>
+                <w:rFonts w:hint="default" w:ascii="Calibri" w:hAnsi="Calibri" w:cs="Calibri"/>
+                <w:b w:val="0"/>
+                <w:bCs w:val="0"/>
+                <w:sz w:val="24"/>
+                <w:szCs w:val="24"/>
+                <w:lang w:val="en-US"/>
+              </w:rPr>
+              <w:t>Single Sign-On (SSO) behavior</w:t>
+            </w:r>
+          </w:p>
+          <w:p>
+            <w:pPr>
+              <w:pStyle w:val="3"/>
+              <w:numPr>
+                <w:ilvl w:val="0"/>
+                <w:numId w:val="2"/>
+              </w:numPr>
+              <w:spacing w:line="360" w:lineRule="auto"/>
+              <w:ind w:right="119"/>
+              <w:jc w:val="left"/>
+              <w:rPr>
+                <w:rFonts w:hint="default" w:ascii="Calibri" w:hAnsi="Calibri" w:cs="Calibri"/>
+                <w:b w:val="0"/>
+                <w:bCs w:val="0"/>
+                <w:sz w:val="24"/>
+                <w:szCs w:val="24"/>
+                <w:lang w:val="en-US"/>
+              </w:rPr>
+            </w:pPr>
+            <w:r>
+              <w:rPr>
+                <w:rFonts w:hint="default" w:ascii="Calibri" w:hAnsi="Calibri" w:cs="Calibri"/>
+                <w:b w:val="0"/>
+                <w:bCs w:val="0"/>
+                <w:sz w:val="24"/>
+                <w:szCs w:val="24"/>
+                <w:lang w:val="en-US"/>
+              </w:rPr>
+              <w:t>SSO Enabled: recurring transactions do not r</w:t>
+            </w:r>
+            <w:bookmarkStart w:id="13" w:name="_GoBack"/>
+            <w:bookmarkEnd w:id="13"/>
+            <w:r>
+              <w:rPr>
+                <w:rFonts w:hint="default" w:ascii="Calibri" w:hAnsi="Calibri" w:cs="Calibri"/>
+                <w:b w:val="0"/>
+                <w:bCs w:val="0"/>
+                <w:sz w:val="24"/>
+                <w:szCs w:val="24"/>
+                <w:lang w:val="en-US"/>
+              </w:rPr>
+              <w:t>equire user consent for each transaction.</w:t>
+            </w:r>
+          </w:p>
+          <w:p>
+            <w:pPr>
+              <w:pStyle w:val="3"/>
+              <w:numPr>
+                <w:ilvl w:val="0"/>
+                <w:numId w:val="2"/>
+              </w:numPr>
+              <w:spacing w:line="360" w:lineRule="auto"/>
+              <w:ind w:right="119"/>
+              <w:jc w:val="left"/>
+              <w:rPr>
+                <w:rFonts w:ascii="Calibri" w:hAnsi="Calibri" w:cs="Calibri"/>
+                <w:b w:val="0"/>
+                <w:bCs w:val="0"/>
+                <w:sz w:val="24"/>
+                <w:szCs w:val="24"/>
+              </w:rPr>
+            </w:pPr>
+            <w:r>
+              <w:rPr>
+                <w:rFonts w:hint="default" w:ascii="Calibri" w:hAnsi="Calibri" w:cs="Calibri"/>
+                <w:b w:val="0"/>
+                <w:bCs w:val="0"/>
+                <w:sz w:val="24"/>
+                <w:szCs w:val="24"/>
+                <w:lang w:val="en-US"/>
+              </w:rPr>
+              <w:t>SSO Disabled: recurring transactions require user approval/consent for every transaction</w:t>
             </w:r>
           </w:p>
         </w:tc>
@@ -3020,36 +3556,40 @@
         <w:tc>
           <w:tcPr>
             <w:tcW w:w="2542" w:type="dxa"/>
+            <w:vAlign w:val="center"/>
           </w:tcPr>
           <w:p>
             <w:pPr>
               <w:pStyle w:val="21"/>
               <w:spacing w:line="360" w:lineRule="auto"/>
               <w:ind w:left="122"/>
-              <w:rPr>
-                <w:rFonts w:ascii="Calibri" w:hAnsi="Calibri" w:cs="Calibri"/>
-                <w:sz w:val="24"/>
-                <w:szCs w:val="24"/>
-              </w:rPr>
-            </w:pPr>
-            <w:r>
-              <w:rPr>
-                <w:rFonts w:ascii="Calibri" w:hAnsi="Calibri" w:cs="Calibri"/>
-                <w:sz w:val="24"/>
-                <w:szCs w:val="24"/>
-              </w:rPr>
-              <w:t xml:space="preserve"> Data Share</w:t>
+              <w:jc w:val="left"/>
+              <w:rPr>
+                <w:rFonts w:ascii="Calibri" w:hAnsi="Calibri" w:cs="Calibri"/>
+                <w:sz w:val="24"/>
+                <w:szCs w:val="24"/>
+              </w:rPr>
+            </w:pPr>
+            <w:r>
+              <w:rPr>
+                <w:rFonts w:ascii="Calibri" w:hAnsi="Calibri" w:cs="Calibri"/>
+                <w:sz w:val="24"/>
+                <w:szCs w:val="24"/>
+              </w:rPr>
+              <w:t>Data Share</w:t>
             </w:r>
           </w:p>
         </w:tc>
         <w:tc>
           <w:tcPr>
             <w:tcW w:w="3260" w:type="dxa"/>
+            <w:vAlign w:val="center"/>
           </w:tcPr>
           <w:p>
             <w:pPr>
               <w:pStyle w:val="21"/>
               <w:spacing w:line="360" w:lineRule="auto"/>
+              <w:jc w:val="left"/>
               <w:rPr>
                 <w:rFonts w:hint="default" w:ascii="Calibri" w:hAnsi="Calibri" w:cs="Calibri"/>
                 <w:b/>
@@ -3088,13 +3628,14 @@
         <w:tc>
           <w:tcPr>
             <w:tcW w:w="4101" w:type="dxa"/>
+            <w:vAlign w:val="center"/>
           </w:tcPr>
           <w:p>
             <w:pPr>
               <w:pStyle w:val="21"/>
               <w:spacing w:after="240" w:line="360" w:lineRule="auto"/>
               <w:ind w:left="138" w:right="119"/>
-              <w:jc w:val="both"/>
+              <w:jc w:val="left"/>
               <w:rPr>
                 <w:rFonts w:ascii="Calibri" w:hAnsi="Calibri" w:cs="Calibri"/>
                 <w:sz w:val="24"/>
@@ -3119,12 +3660,14 @@
         <w:tc>
           <w:tcPr>
             <w:tcW w:w="2542" w:type="dxa"/>
+            <w:vAlign w:val="center"/>
           </w:tcPr>
           <w:p>
             <w:pPr>
               <w:pStyle w:val="21"/>
               <w:spacing w:line="360" w:lineRule="auto"/>
               <w:ind w:left="122"/>
+              <w:jc w:val="left"/>
               <w:rPr>
                 <w:rFonts w:ascii="Calibri" w:hAnsi="Calibri" w:cs="Calibri"/>
                 <w:sz w:val="24"/>
@@ -3144,11 +3687,13 @@
         <w:tc>
           <w:tcPr>
             <w:tcW w:w="3260" w:type="dxa"/>
+            <w:vAlign w:val="center"/>
           </w:tcPr>
           <w:p>
             <w:pPr>
               <w:pStyle w:val="21"/>
               <w:spacing w:line="360" w:lineRule="auto"/>
+              <w:jc w:val="left"/>
               <w:rPr>
                 <w:rFonts w:ascii="Calibri" w:hAnsi="Calibri" w:cs="Calibri"/>
                 <w:sz w:val="24"/>
@@ -3177,12 +3722,14 @@
         <w:tc>
           <w:tcPr>
             <w:tcW w:w="4101" w:type="dxa"/>
+            <w:vAlign w:val="center"/>
           </w:tcPr>
           <w:p>
             <w:pPr>
               <w:pStyle w:val="21"/>
               <w:spacing w:line="360" w:lineRule="auto"/>
               <w:ind w:left="135"/>
+              <w:jc w:val="left"/>
               <w:rPr>
                 <w:rFonts w:ascii="Calibri" w:hAnsi="Calibri" w:cs="Calibri"/>
                 <w:sz w:val="24"/>
@@ -3207,12 +3754,14 @@
         <w:tc>
           <w:tcPr>
             <w:tcW w:w="2542" w:type="dxa"/>
+            <w:vAlign w:val="center"/>
           </w:tcPr>
           <w:p>
             <w:pPr>
               <w:pStyle w:val="21"/>
               <w:spacing w:line="360" w:lineRule="auto"/>
               <w:ind w:left="122"/>
+              <w:jc w:val="left"/>
               <w:rPr>
                 <w:rFonts w:ascii="Calibri" w:hAnsi="Calibri" w:cs="Calibri"/>
                 <w:sz w:val="24"/>
@@ -3232,11 +3781,13 @@
         <w:tc>
           <w:tcPr>
             <w:tcW w:w="3260" w:type="dxa"/>
+            <w:vAlign w:val="center"/>
           </w:tcPr>
           <w:p>
             <w:pPr>
               <w:pStyle w:val="21"/>
               <w:spacing w:line="360" w:lineRule="auto"/>
+              <w:jc w:val="left"/>
               <w:rPr>
                 <w:rFonts w:ascii="Calibri" w:hAnsi="Calibri" w:cs="Calibri"/>
                 <w:b/>
@@ -3269,12 +3820,14 @@
         <w:tc>
           <w:tcPr>
             <w:tcW w:w="4101" w:type="dxa"/>
+            <w:vAlign w:val="center"/>
           </w:tcPr>
           <w:p>
             <w:pPr>
               <w:pStyle w:val="21"/>
               <w:spacing w:line="360" w:lineRule="auto"/>
               <w:ind w:left="135"/>
+              <w:jc w:val="left"/>
               <w:rPr>
                 <w:rFonts w:ascii="Calibri" w:hAnsi="Calibri" w:cs="Calibri"/>
                 <w:sz w:val="24"/>
@@ -3300,12 +3853,14 @@
         <w:tc>
           <w:tcPr>
             <w:tcW w:w="2542" w:type="dxa"/>
+            <w:vAlign w:val="center"/>
           </w:tcPr>
           <w:p>
             <w:pPr>
               <w:pStyle w:val="21"/>
               <w:spacing w:line="360" w:lineRule="auto"/>
               <w:ind w:left="122"/>
+              <w:jc w:val="left"/>
               <w:rPr>
                 <w:rFonts w:ascii="Calibri" w:hAnsi="Calibri" w:cs="Calibri"/>
                 <w:sz w:val="24"/>
@@ -3325,11 +3880,13 @@
         <w:tc>
           <w:tcPr>
             <w:tcW w:w="3260" w:type="dxa"/>
+            <w:vAlign w:val="center"/>
           </w:tcPr>
           <w:p>
             <w:pPr>
               <w:pStyle w:val="21"/>
               <w:spacing w:line="360" w:lineRule="auto"/>
+              <w:jc w:val="left"/>
               <w:rPr>
                 <w:rFonts w:ascii="Calibri" w:hAnsi="Calibri" w:cs="Calibri"/>
                 <w:b/>
@@ -3357,6 +3914,7 @@
             <w:pPr>
               <w:pStyle w:val="21"/>
               <w:spacing w:line="360" w:lineRule="auto"/>
+              <w:jc w:val="left"/>
               <w:rPr>
                 <w:rFonts w:ascii="Calibri" w:hAnsi="Calibri" w:cs="Calibri"/>
                 <w:sz w:val="24"/>
@@ -3368,6 +3926,7 @@
         <w:tc>
           <w:tcPr>
             <w:tcW w:w="4101" w:type="dxa"/>
+            <w:vAlign w:val="center"/>
           </w:tcPr>
           <w:p>
             <w:pPr>
@@ -3377,6 +3936,7 @@
                 <w:numId w:val="3"/>
               </w:numPr>
               <w:spacing w:line="360" w:lineRule="auto"/>
+              <w:jc w:val="left"/>
               <w:rPr>
                 <w:rFonts w:ascii="Calibri" w:hAnsi="Calibri" w:cs="Calibri"/>
                 <w:sz w:val="24"/>
@@ -3418,6 +3978,7 @@
                 <w:numId w:val="3"/>
               </w:numPr>
               <w:spacing w:line="360" w:lineRule="auto"/>
+              <w:jc w:val="left"/>
               <w:rPr>
                 <w:rFonts w:ascii="Calibri" w:hAnsi="Calibri" w:cs="Calibri"/>
               </w:rPr>
@@ -3458,12 +4019,14 @@
         <w:tc>
           <w:tcPr>
             <w:tcW w:w="2542" w:type="dxa"/>
+            <w:vAlign w:val="center"/>
           </w:tcPr>
           <w:p>
             <w:pPr>
               <w:pStyle w:val="21"/>
               <w:spacing w:line="360" w:lineRule="auto"/>
               <w:ind w:left="122"/>
+              <w:jc w:val="left"/>
               <w:rPr>
                 <w:rFonts w:ascii="Calibri" w:hAnsi="Calibri" w:cs="Calibri"/>
                 <w:sz w:val="24"/>
@@ -3483,11 +4046,13 @@
         <w:tc>
           <w:tcPr>
             <w:tcW w:w="3260" w:type="dxa"/>
+            <w:vAlign w:val="center"/>
           </w:tcPr>
           <w:p>
             <w:pPr>
               <w:pStyle w:val="21"/>
               <w:spacing w:line="360" w:lineRule="auto"/>
+              <w:jc w:val="left"/>
               <w:rPr>
                 <w:rFonts w:hint="default" w:ascii="Calibri" w:hAnsi="Calibri" w:cs="Calibri"/>
                 <w:sz w:val="24"/>
@@ -3509,12 +4074,14 @@
         <w:tc>
           <w:tcPr>
             <w:tcW w:w="4101" w:type="dxa"/>
+            <w:vAlign w:val="center"/>
           </w:tcPr>
           <w:p>
             <w:pPr>
               <w:pStyle w:val="21"/>
               <w:spacing w:line="360" w:lineRule="auto"/>
               <w:ind w:left="135"/>
+              <w:jc w:val="left"/>
               <w:rPr>
                 <w:rFonts w:ascii="Calibri" w:hAnsi="Calibri" w:cs="Calibri"/>
                 <w:sz w:val="24"/>
@@ -3539,12 +4106,14 @@
         <w:tc>
           <w:tcPr>
             <w:tcW w:w="2542" w:type="dxa"/>
+            <w:vAlign w:val="center"/>
           </w:tcPr>
           <w:p>
             <w:pPr>
               <w:pStyle w:val="21"/>
               <w:spacing w:line="360" w:lineRule="auto"/>
               <w:ind w:left="122"/>
+              <w:jc w:val="left"/>
               <w:rPr>
                 <w:rFonts w:hint="default" w:ascii="Calibri" w:hAnsi="Calibri" w:cs="Calibri"/>
                 <w:sz w:val="24"/>
@@ -3566,11 +4135,13 @@
         <w:tc>
           <w:tcPr>
             <w:tcW w:w="3260" w:type="dxa"/>
+            <w:vAlign w:val="center"/>
           </w:tcPr>
           <w:p>
             <w:pPr>
               <w:pStyle w:val="21"/>
               <w:spacing w:line="360" w:lineRule="auto"/>
+              <w:jc w:val="left"/>
               <w:rPr>
                 <w:rFonts w:hint="default" w:ascii="Calibri" w:hAnsi="Calibri" w:cs="Calibri"/>
                 <w:sz w:val="24"/>
@@ -3592,12 +4163,14 @@
         <w:tc>
           <w:tcPr>
             <w:tcW w:w="4101" w:type="dxa"/>
+            <w:vAlign w:val="center"/>
           </w:tcPr>
           <w:p>
             <w:pPr>
               <w:pStyle w:val="21"/>
               <w:spacing w:line="360" w:lineRule="auto"/>
               <w:ind w:left="135"/>
+              <w:jc w:val="left"/>
               <w:rPr>
                 <w:rFonts w:hint="default" w:ascii="Calibri" w:hAnsi="Calibri" w:cs="Calibri"/>
                 <w:sz w:val="24"/>
@@ -3614,8 +4187,6 @@
               </w:rPr>
               <w:t>Link for redirect to merchant application</w:t>
             </w:r>
-            <w:bookmarkStart w:id="13" w:name="_GoBack"/>
-            <w:bookmarkEnd w:id="13"/>
           </w:p>
         </w:tc>
       </w:tr>
@@ -3626,12 +4197,14 @@
         <w:tc>
           <w:tcPr>
             <w:tcW w:w="2542" w:type="dxa"/>
+            <w:vAlign w:val="center"/>
           </w:tcPr>
           <w:p>
             <w:pPr>
               <w:pStyle w:val="21"/>
               <w:spacing w:line="360" w:lineRule="auto"/>
               <w:ind w:left="122"/>
+              <w:jc w:val="left"/>
               <w:rPr>
                 <w:rFonts w:ascii="Calibri" w:hAnsi="Calibri" w:cs="Calibri"/>
                 <w:sz w:val="24"/>
@@ -3651,11 +4224,13 @@
         <w:tc>
           <w:tcPr>
             <w:tcW w:w="3260" w:type="dxa"/>
+            <w:vAlign w:val="center"/>
           </w:tcPr>
           <w:p>
             <w:pPr>
               <w:pStyle w:val="21"/>
               <w:spacing w:line="360" w:lineRule="auto"/>
+              <w:jc w:val="left"/>
               <w:rPr>
                 <w:rFonts w:hint="default" w:ascii="Calibri" w:hAnsi="Calibri" w:cs="Calibri"/>
                 <w:sz w:val="24"/>
@@ -3677,12 +4252,14 @@
         <w:tc>
           <w:tcPr>
             <w:tcW w:w="4101" w:type="dxa"/>
+            <w:vAlign w:val="center"/>
           </w:tcPr>
           <w:p>
             <w:pPr>
               <w:pStyle w:val="21"/>
               <w:spacing w:line="360" w:lineRule="auto"/>
               <w:ind w:left="135"/>
+              <w:jc w:val="left"/>
               <w:rPr>
                 <w:rFonts w:ascii="Calibri" w:hAnsi="Calibri" w:cs="Calibri"/>
                 <w:sz w:val="24"/>
@@ -8403,32 +8980,8 @@
 </file>
 
 <file path=customXml/item2.xml><?xml version="1.0" encoding="utf-8"?>
-<p:properties xmlns:xsi="http://www.w3.org/2001/XMLSchema-instance" xmlns:pc="http://schemas.microsoft.com/office/infopath/2007/PartnerControls" xmlns:p="http://schemas.microsoft.com/office/2006/metadata/properties">
-  <documentManagement>
-    <lcf76f155ced4ddcb4097134ff3c332f xmlns="eacbaa89-6f05-4783-8bdd-d7e016ae47e9">
-      <Terms xmlns="http://schemas.microsoft.com/office/infopath/2007/PartnerControls"/>
-    </lcf76f155ced4ddcb4097134ff3c332f>
-    <TaxCatchAll xmlns="f77844bf-a94f-4508-a9e5-085bc09476b6" xsi:nil="true"/>
-  </documentManagement>
-</p:properties>
-</file>
-
-<file path=customXml/item3.xml><?xml version="1.0" encoding="utf-8"?>
-<b:Sources xmlns="http://schemas.openxmlformats.org/officeDocument/2006/bibliography" xmlns:b="http://schemas.openxmlformats.org/officeDocument/2006/bibliography" Version="6" SelectedStyle="/APASixthEditionOfficeOnline.xsl" StyleName="APA"/>
-</file>
-
-<file path=customXml/item4.xml><?xml version="1.0" encoding="utf-8"?>
-<?mso-contentType ?>
-<FormTemplates xmlns="http://schemas.microsoft.com/sharepoint/v3/contenttype/forms">
-  <Display>DocumentLibraryForm</Display>
-  <Edit>DocumentLibraryForm</Edit>
-  <New>DocumentLibraryForm</New>
-</FormTemplates>
-</file>
-
-<file path=customXml/item5.xml><?xml version="1.0" encoding="utf-8"?>
-<ct:contentTypeSchema xmlns:ct="http://schemas.microsoft.com/office/2006/metadata/contentType" xmlns:ma="http://schemas.microsoft.com/office/2006/metadata/properties/metaAttributes" ma:contentTypeVersion="18" ma:contentTypeDescription="Create a new document." ct:_="" ma:contentTypeID="0x010100A8015C8F28DCAC47983C9ECF64F44B7B" ma:_="" ma:contentTypeName="Document" ma:versionID="aa240b6de93a5bca7900e5021e6f895a" ma:contentTypeScope="">
-  <xsd:schema xmlns:p="http://schemas.microsoft.com/office/2006/metadata/properties" xmlns:ns2="eacbaa89-6f05-4783-8bdd-d7e016ae47e9" xmlns:ns3="f77844bf-a94f-4508-a9e5-085bc09476b6" xmlns:xs="http://www.w3.org/2001/XMLSchema" xmlns:xsd="http://www.w3.org/2001/XMLSchema" ma:fieldsID="aa8b4d4f7604ce7475ca58993237c145" ns3:_="" targetNamespace="http://schemas.microsoft.com/office/2006/metadata/properties" ns2:_="" ma:root="true">
+<ct:contentTypeSchema xmlns:ct="http://schemas.microsoft.com/office/2006/metadata/contentType" xmlns:ma="http://schemas.microsoft.com/office/2006/metadata/properties/metaAttributes" ma:contentTypeVersion="18" ma:contentTypeID="0x010100A8015C8F28DCAC47983C9ECF64F44B7B" ma:versionID="aa240b6de93a5bca7900e5021e6f895a" ct:_="" ma:contentTypeScope="" ma:_="" ma:contentTypeDescription="Create a new document." ma:contentTypeName="Document">
+  <xsd:schema xmlns:ns2="eacbaa89-6f05-4783-8bdd-d7e016ae47e9" xmlns:ns3="f77844bf-a94f-4508-a9e5-085bc09476b6" xmlns:xsd="http://www.w3.org/2001/XMLSchema" xmlns:p="http://schemas.microsoft.com/office/2006/metadata/properties" xmlns:xs="http://www.w3.org/2001/XMLSchema" targetNamespace="http://schemas.microsoft.com/office/2006/metadata/properties" ns3:_="" ma:root="true" ma:fieldsID="aa8b4d4f7604ce7475ca58993237c145" ns2:_="">
     <xsd:import namespace="eacbaa89-6f05-4783-8bdd-d7e016ae47e9"/>
     <xsd:import namespace="f77844bf-a94f-4508-a9e5-085bc09476b6"/>
     <xsd:element name="properties">
@@ -8461,100 +9014,100 @@
       </xsd:complexType>
     </xsd:element>
   </xsd:schema>
-  <xsd:schema xmlns:dms="http://schemas.microsoft.com/office/2006/documentManagement/types" xmlns:pc="http://schemas.microsoft.com/office/infopath/2007/PartnerControls" xmlns:xs="http://www.w3.org/2001/XMLSchema" xmlns:xsd="http://www.w3.org/2001/XMLSchema" targetNamespace="eacbaa89-6f05-4783-8bdd-d7e016ae47e9" elementFormDefault="qualified">
+  <xsd:schema xmlns:xsd="http://www.w3.org/2001/XMLSchema" xmlns:pc="http://schemas.microsoft.com/office/infopath/2007/PartnerControls" xmlns:dms="http://schemas.microsoft.com/office/2006/documentManagement/types" xmlns:xs="http://www.w3.org/2001/XMLSchema" targetNamespace="eacbaa89-6f05-4783-8bdd-d7e016ae47e9" elementFormDefault="qualified">
     <xsd:import namespace="http://schemas.microsoft.com/office/2006/documentManagement/types"/>
     <xsd:import namespace="http://schemas.microsoft.com/office/infopath/2007/PartnerControls"/>
-    <xsd:element ma:readOnly="true" nillable="true" name="MediaServiceMetadata" ma:index="8" ma:hidden="true" ma:displayName="MediaServiceMetadata" ma:internalName="MediaServiceMetadata">
+    <xsd:element ma:hidden="true" nillable="true" name="MediaServiceMetadata" ma:index="8" ma:readOnly="true" ma:displayName="MediaServiceMetadata" ma:internalName="MediaServiceMetadata">
       <xsd:simpleType>
         <xsd:restriction base="dms:Note"/>
       </xsd:simpleType>
     </xsd:element>
-    <xsd:element ma:readOnly="true" nillable="true" name="MediaServiceFastMetadata" ma:index="9" ma:hidden="true" ma:displayName="MediaServiceFastMetadata" ma:internalName="MediaServiceFastMetadata">
+    <xsd:element ma:hidden="true" nillable="true" name="MediaServiceFastMetadata" ma:index="9" ma:readOnly="true" ma:displayName="MediaServiceFastMetadata" ma:internalName="MediaServiceFastMetadata">
       <xsd:simpleType>
         <xsd:restriction base="dms:Note"/>
       </xsd:simpleType>
     </xsd:element>
-    <xsd:element ma:readOnly="true" nillable="true" name="MediaServiceAutoKeyPoints" ma:index="10" ma:hidden="true" ma:displayName="MediaServiceAutoKeyPoints" ma:internalName="MediaServiceAutoKeyPoints">
+    <xsd:element ma:hidden="true" nillable="true" name="MediaServiceAutoKeyPoints" ma:index="10" ma:readOnly="true" ma:displayName="MediaServiceAutoKeyPoints" ma:internalName="MediaServiceAutoKeyPoints">
       <xsd:simpleType>
         <xsd:restriction base="dms:Note"/>
       </xsd:simpleType>
     </xsd:element>
-    <xsd:element ma:readOnly="true" nillable="true" name="MediaServiceKeyPoints" ma:index="11" ma:displayName="KeyPoints" ma:internalName="MediaServiceKeyPoints">
+    <xsd:element nillable="true" name="MediaServiceKeyPoints" ma:index="11" ma:readOnly="true" ma:displayName="KeyPoints" ma:internalName="MediaServiceKeyPoints">
       <xsd:simpleType>
         <xsd:restriction base="dms:Note">
           <xsd:maxLength value="255"/>
         </xsd:restriction>
       </xsd:simpleType>
     </xsd:element>
-    <xsd:element ma:readOnly="true" nillable="true" name="MediaServiceAutoTags" ma:index="12" ma:displayName="Tags" ma:internalName="MediaServiceAutoTags">
+    <xsd:element nillable="true" name="MediaServiceAutoTags" ma:index="12" ma:readOnly="true" ma:displayName="Tags" ma:internalName="MediaServiceAutoTags">
       <xsd:simpleType>
         <xsd:restriction base="dms:Text"/>
       </xsd:simpleType>
     </xsd:element>
-    <xsd:element ma:readOnly="true" nillable="true" name="MediaServiceOCR" ma:index="13" ma:displayName="Extracted Text" ma:internalName="MediaServiceOCR">
+    <xsd:element nillable="true" name="MediaServiceOCR" ma:index="13" ma:readOnly="true" ma:displayName="Extracted Text" ma:internalName="MediaServiceOCR">
       <xsd:simpleType>
         <xsd:restriction base="dms:Note">
           <xsd:maxLength value="255"/>
         </xsd:restriction>
       </xsd:simpleType>
     </xsd:element>
-    <xsd:element ma:readOnly="true" nillable="true" name="MediaServiceGenerationTime" ma:index="14" ma:hidden="true" ma:displayName="MediaServiceGenerationTime" ma:internalName="MediaServiceGenerationTime">
+    <xsd:element ma:hidden="true" nillable="true" name="MediaServiceGenerationTime" ma:index="14" ma:readOnly="true" ma:displayName="MediaServiceGenerationTime" ma:internalName="MediaServiceGenerationTime">
       <xsd:simpleType>
         <xsd:restriction base="dms:Text"/>
       </xsd:simpleType>
     </xsd:element>
-    <xsd:element ma:readOnly="true" nillable="true" name="MediaServiceEventHashCode" ma:index="15" ma:hidden="true" ma:displayName="MediaServiceEventHashCode" ma:internalName="MediaServiceEventHashCode">
+    <xsd:element ma:hidden="true" nillable="true" name="MediaServiceEventHashCode" ma:index="15" ma:readOnly="true" ma:displayName="MediaServiceEventHashCode" ma:internalName="MediaServiceEventHashCode">
       <xsd:simpleType>
         <xsd:restriction base="dms:Text"/>
       </xsd:simpleType>
     </xsd:element>
-    <xsd:element ma:readOnly="true" nillable="true" name="MediaLengthInSeconds" ma:index="18" ma:hidden="true" ma:displayName="MediaLengthInSeconds" ma:internalName="MediaLengthInSeconds">
+    <xsd:element ma:hidden="true" nillable="true" name="MediaLengthInSeconds" ma:index="18" ma:readOnly="true" ma:displayName="MediaLengthInSeconds" ma:internalName="MediaLengthInSeconds">
       <xsd:simpleType>
         <xsd:restriction base="dms:Unknown"/>
       </xsd:simpleType>
     </xsd:element>
-    <xsd:element ma:anchorId="fba54fb3-c3e1-fe81-a776-ca4b69148c4d" ma:readOnly="false" nillable="true" name="lcf76f155ced4ddcb4097134ff3c332f" ma:sspId="caa14961-3a97-4a50-88cd-37ec0b5dad00" ma:taxonomy="true" ma:index="20" ma:open="true" ma:taxonomyMulti="true" ma:isKeyword="false" ma:taxonomyFieldName="MediaServiceImageTags" ma:termSetId="09814cd3-568e-fe90-9814-8d621ff8fb84" ma:displayName="Image Tags" ma:internalName="lcf76f155ced4ddcb4097134ff3c332f" ma:fieldId="{5cf76f15-5ced-4ddc-b409-7134ff3c332f}">
+    <xsd:element ma:taxonomyFieldName="MediaServiceImageTags" nillable="true" ma:sspId="caa14961-3a97-4a50-88cd-37ec0b5dad00" ma:open="true" ma:taxonomyMulti="true" name="lcf76f155ced4ddcb4097134ff3c332f" ma:index="20" ma:isKeyword="false" ma:anchorId="fba54fb3-c3e1-fe81-a776-ca4b69148c4d" ma:fieldId="{5cf76f15-5ced-4ddc-b409-7134ff3c332f}" ma:readOnly="false" ma:termSetId="09814cd3-568e-fe90-9814-8d621ff8fb84" ma:displayName="Image Tags" ma:taxonomy="true" ma:internalName="lcf76f155ced4ddcb4097134ff3c332f">
       <xsd:complexType>
         <xsd:sequence>
           <xsd:element maxOccurs="1" minOccurs="0" ref="pc:Terms"/>
         </xsd:sequence>
       </xsd:complexType>
     </xsd:element>
-    <xsd:element ma:readOnly="true" nillable="true" name="MediaServiceObjectDetectorVersions" ma:indexed="true" ma:index="22" ma:hidden="true" ma:displayName="MediaServiceObjectDetectorVersions" ma:internalName="MediaServiceObjectDetectorVersions">
+    <xsd:element ma:hidden="true" nillable="true" name="MediaServiceObjectDetectorVersions" ma:index="22" ma:readOnly="true" ma:indexed="true" ma:displayName="MediaServiceObjectDetectorVersions" ma:internalName="MediaServiceObjectDetectorVersions">
       <xsd:simpleType>
         <xsd:restriction base="dms:Text"/>
       </xsd:simpleType>
     </xsd:element>
-    <xsd:element ma:readOnly="true" nillable="true" name="MediaServiceDateTaken" ma:indexed="true" ma:index="23" ma:hidden="true" ma:displayName="MediaServiceDateTaken" ma:internalName="MediaServiceDateTaken">
+    <xsd:element ma:hidden="true" nillable="true" name="MediaServiceDateTaken" ma:index="23" ma:readOnly="true" ma:indexed="true" ma:displayName="MediaServiceDateTaken" ma:internalName="MediaServiceDateTaken">
       <xsd:simpleType>
         <xsd:restriction base="dms:Text"/>
       </xsd:simpleType>
     </xsd:element>
-    <xsd:element ma:readOnly="true" nillable="true" name="MediaServiceSearchProperties" ma:index="24" ma:hidden="true" ma:displayName="MediaServiceSearchProperties" ma:internalName="MediaServiceSearchProperties">
+    <xsd:element ma:hidden="true" nillable="true" name="MediaServiceSearchProperties" ma:index="24" ma:readOnly="true" ma:displayName="MediaServiceSearchProperties" ma:internalName="MediaServiceSearchProperties">
       <xsd:simpleType>
         <xsd:restriction base="dms:Note"/>
       </xsd:simpleType>
     </xsd:element>
-    <xsd:element ma:readOnly="true" nillable="true" name="MediaServiceBillingMetadata" ma:index="25" ma:hidden="true" ma:displayName="MediaServiceBillingMetadata" ma:internalName="MediaServiceBillingMetadata">
+    <xsd:element ma:hidden="true" nillable="true" name="MediaServiceBillingMetadata" ma:index="25" ma:readOnly="true" ma:displayName="MediaServiceBillingMetadata" ma:internalName="MediaServiceBillingMetadata">
       <xsd:simpleType>
         <xsd:restriction base="dms:Note"/>
       </xsd:simpleType>
     </xsd:element>
   </xsd:schema>
-  <xsd:schema xmlns:dms="http://schemas.microsoft.com/office/2006/documentManagement/types" xmlns:pc="http://schemas.microsoft.com/office/infopath/2007/PartnerControls" xmlns:xs="http://www.w3.org/2001/XMLSchema" xmlns:xsd="http://www.w3.org/2001/XMLSchema" targetNamespace="f77844bf-a94f-4508-a9e5-085bc09476b6" elementFormDefault="qualified">
+  <xsd:schema xmlns:xsd="http://www.w3.org/2001/XMLSchema" xmlns:pc="http://schemas.microsoft.com/office/infopath/2007/PartnerControls" xmlns:dms="http://schemas.microsoft.com/office/2006/documentManagement/types" xmlns:xs="http://www.w3.org/2001/XMLSchema" targetNamespace="f77844bf-a94f-4508-a9e5-085bc09476b6" elementFormDefault="qualified">
     <xsd:import namespace="http://schemas.microsoft.com/office/2006/documentManagement/types"/>
     <xsd:import namespace="http://schemas.microsoft.com/office/infopath/2007/PartnerControls"/>
-    <xsd:element ma:readOnly="true" nillable="true" name="SharedWithUsers" ma:index="16" ma:displayName="Shared With" ma:internalName="SharedWithUsers">
+    <xsd:element nillable="true" name="SharedWithUsers" ma:index="16" ma:readOnly="true" ma:displayName="Shared With" ma:internalName="SharedWithUsers">
       <xsd:complexType>
         <xsd:complexContent>
           <xsd:extension base="dms:UserMulti">
             <xsd:sequence>
-              <xsd:element maxOccurs="unbounded" minOccurs="0" name="UserInfo">
+              <xsd:element maxOccurs="unbounded" name="UserInfo" minOccurs="0">
                 <xsd:complexType>
                   <xsd:sequence>
-                    <xsd:element minOccurs="0" name="DisplayName" type="xsd:string"/>
-                    <xsd:element minOccurs="0" nillable="true" name="AccountId" type="dms:UserId"/>
-                    <xsd:element minOccurs="0" name="AccountType" type="xsd:string"/>
+                    <xsd:element type="xsd:string" name="DisplayName" minOccurs="0"/>
+                    <xsd:element type="dms:UserId" nillable="true" name="AccountId" minOccurs="0"/>
+                    <xsd:element type="xsd:string" name="AccountType" minOccurs="0"/>
                   </xsd:sequence>
                 </xsd:complexType>
               </xsd:element>
@@ -8563,56 +9116,56 @@
         </xsd:complexContent>
       </xsd:complexType>
     </xsd:element>
-    <xsd:element ma:readOnly="true" nillable="true" name="SharedWithDetails" ma:index="17" ma:displayName="Shared With Details" ma:internalName="SharedWithDetails">
+    <xsd:element nillable="true" name="SharedWithDetails" ma:index="17" ma:readOnly="true" ma:displayName="Shared With Details" ma:internalName="SharedWithDetails">
       <xsd:simpleType>
         <xsd:restriction base="dms:Note">
           <xsd:maxLength value="255"/>
         </xsd:restriction>
       </xsd:simpleType>
     </xsd:element>
-    <xsd:element nillable="true" name="TaxCatchAll" ma:index="21" ma:list="{57524694-6724-4ff2-8734-e6dfacb36b6e}" ma:showField="CatchAllData" ma:web="f77844bf-a94f-4508-a9e5-085bc09476b6" ma:hidden="true" ma:displayName="Taxonomy Catch All Column" ma:internalName="TaxCatchAll">
+    <xsd:element ma:web="f77844bf-a94f-4508-a9e5-085bc09476b6" ma:hidden="true" nillable="true" ma:list="{57524694-6724-4ff2-8734-e6dfacb36b6e}" ma:showField="CatchAllData" name="TaxCatchAll" ma:index="21" ma:displayName="Taxonomy Catch All Column" ma:internalName="TaxCatchAll">
       <xsd:complexType>
         <xsd:complexContent>
           <xsd:extension base="dms:MultiChoiceLookup">
             <xsd:sequence>
-              <xsd:element maxOccurs="unbounded" minOccurs="0" nillable="true" name="Value" type="dms:Lookup"/>
+              <xsd:element type="dms:Lookup" nillable="true" maxOccurs="unbounded" name="Value" minOccurs="0"/>
             </xsd:sequence>
           </xsd:extension>
         </xsd:complexContent>
       </xsd:complexType>
     </xsd:element>
   </xsd:schema>
-  <xsd:schema xmlns:odoc="http://schemas.microsoft.com/internal/obd" xmlns:xsi="http://www.w3.org/2001/XMLSchema-instance" xmlns:dc="http://purl.org/dc/elements/1.1/" xmlns="http://schemas.openxmlformats.org/package/2006/metadata/core-properties" xmlns:dcterms="http://purl.org/dc/terms/" xmlns:xsd="http://www.w3.org/2001/XMLSchema" targetNamespace="http://schemas.openxmlformats.org/package/2006/metadata/core-properties" elementFormDefault="qualified" attributeFormDefault="unqualified" blockDefault="#all">
+  <xsd:schema xmlns:xsd="http://www.w3.org/2001/XMLSchema" xmlns:dc="http://purl.org/dc/elements/1.1/" xmlns:xsi="http://www.w3.org/2001/XMLSchema-instance" xmlns:odoc="http://schemas.microsoft.com/internal/obd" xmlns="http://schemas.openxmlformats.org/package/2006/metadata/core-properties" xmlns:dcterms="http://purl.org/dc/terms/" targetNamespace="http://schemas.openxmlformats.org/package/2006/metadata/core-properties" blockDefault="#all" attributeFormDefault="unqualified" elementFormDefault="qualified">
     <xsd:import namespace="http://purl.org/dc/elements/1.1/" schemaLocation="http://dublincore.org/schemas/xmls/qdc/2003/04/02/dc.xsd"/>
     <xsd:import namespace="http://purl.org/dc/terms/" schemaLocation="http://dublincore.org/schemas/xmls/qdc/2003/04/02/dcterms.xsd"/>
-    <xsd:element name="coreProperties" type="CT_coreProperties"/>
+    <xsd:element type="CT_coreProperties" name="coreProperties"/>
     <xsd:complexType name="CT_coreProperties">
       <xsd:all>
         <xsd:element maxOccurs="1" minOccurs="0" ref="dc:creator"/>
         <xsd:element maxOccurs="1" minOccurs="0" ref="dcterms:created"/>
         <xsd:element maxOccurs="1" minOccurs="0" ref="dc:identifier"/>
-        <xsd:element maxOccurs="1" minOccurs="0" name="contentType" ma:index="0" type="xsd:string" ma:displayName="Content Type"/>
-        <xsd:element maxOccurs="1" minOccurs="0" ma:index="4" ma:displayName="Title" ref="dc:title"/>
+        <xsd:element type="xsd:string" maxOccurs="1" name="contentType" ma:index="0" minOccurs="0" ma:displayName="Content Type"/>
+        <xsd:element maxOccurs="1" ma:index="4" minOccurs="0" ma:displayName="Title" ref="dc:title"/>
         <xsd:element maxOccurs="1" minOccurs="0" ref="dc:subject"/>
         <xsd:element maxOccurs="1" minOccurs="0" ref="dc:description"/>
-        <xsd:element maxOccurs="1" minOccurs="0" name="keywords" type="xsd:string"/>
+        <xsd:element type="xsd:string" maxOccurs="1" name="keywords" minOccurs="0"/>
         <xsd:element maxOccurs="1" minOccurs="0" ref="dc:language"/>
-        <xsd:element maxOccurs="1" minOccurs="0" name="category" type="xsd:string"/>
-        <xsd:element maxOccurs="1" minOccurs="0" name="version" type="xsd:string"/>
-        <xsd:element maxOccurs="1" minOccurs="0" name="revision" type="xsd:string">
+        <xsd:element type="xsd:string" maxOccurs="1" name="category" minOccurs="0"/>
+        <xsd:element type="xsd:string" maxOccurs="1" name="version" minOccurs="0"/>
+        <xsd:element type="xsd:string" maxOccurs="1" name="revision" minOccurs="0">
           <xsd:annotation>
             <xsd:documentation>
                         This value indicates the number of saves or revisions. The application is responsible for updating this value after each revision.
                     </xsd:documentation>
           </xsd:annotation>
         </xsd:element>
-        <xsd:element maxOccurs="1" minOccurs="0" name="lastModifiedBy" type="xsd:string"/>
+        <xsd:element type="xsd:string" maxOccurs="1" name="lastModifiedBy" minOccurs="0"/>
         <xsd:element maxOccurs="1" minOccurs="0" ref="dcterms:modified"/>
-        <xsd:element maxOccurs="1" minOccurs="0" name="contentStatus" type="xsd:string"/>
+        <xsd:element type="xsd:string" maxOccurs="1" name="contentStatus" minOccurs="0"/>
       </xsd:all>
     </xsd:complexType>
   </xsd:schema>
-  <xs:schema xmlns:pc="http://schemas.microsoft.com/office/infopath/2007/PartnerControls" xmlns:xs="http://www.w3.org/2001/XMLSchema" targetNamespace="http://schemas.microsoft.com/office/infopath/2007/PartnerControls" elementFormDefault="qualified" attributeFormDefault="unqualified">
+  <xs:schema xmlns:pc="http://schemas.microsoft.com/office/infopath/2007/PartnerControls" xmlns:xs="http://www.w3.org/2001/XMLSchema" targetNamespace="http://schemas.microsoft.com/office/infopath/2007/PartnerControls" attributeFormDefault="unqualified" elementFormDefault="qualified">
     <xs:element name="Person">
       <xs:complexType>
         <xs:sequence>
@@ -8622,9 +9175,9 @@
         </xs:sequence>
       </xs:complexType>
     </xs:element>
-    <xs:element name="DisplayName" type="xs:string"/>
-    <xs:element name="AccountId" type="xs:string"/>
-    <xs:element name="AccountType" type="xs:string"/>
+    <xs:element type="xs:string" name="DisplayName"/>
+    <xs:element type="xs:string" name="AccountId"/>
+    <xs:element type="xs:string" name="AccountType"/>
     <xs:element name="BDCAssociatedEntity">
       <xs:complexType>
         <xs:sequence>
@@ -8636,10 +9189,10 @@
         <xs:attribute ref="pc:AssociationName"/>
       </xs:complexType>
     </xs:element>
-    <xs:attribute name="EntityNamespace" type="xs:string"/>
-    <xs:attribute name="EntityName" type="xs:string"/>
-    <xs:attribute name="SystemInstanceName" type="xs:string"/>
-    <xs:attribute name="AssociationName" type="xs:string"/>
+    <xs:attribute type="xs:string" name="EntityNamespace"/>
+    <xs:attribute type="xs:string" name="EntityName"/>
+    <xs:attribute type="xs:string" name="SystemInstanceName"/>
+    <xs:attribute type="xs:string" name="AssociationName"/>
     <xs:element name="BDCEntity">
       <xs:complexType>
         <xs:sequence>
@@ -8653,13 +9206,13 @@
         </xs:sequence>
       </xs:complexType>
     </xs:element>
-    <xs:element name="EntityDisplayName" type="xs:string"/>
-    <xs:element name="EntityInstanceReference" type="xs:string"/>
-    <xs:element name="EntityId1" type="xs:string"/>
-    <xs:element name="EntityId2" type="xs:string"/>
-    <xs:element name="EntityId3" type="xs:string"/>
-    <xs:element name="EntityId4" type="xs:string"/>
-    <xs:element name="EntityId5" type="xs:string"/>
+    <xs:element type="xs:string" name="EntityDisplayName"/>
+    <xs:element type="xs:string" name="EntityInstanceReference"/>
+    <xs:element type="xs:string" name="EntityId1"/>
+    <xs:element type="xs:string" name="EntityId2"/>
+    <xs:element type="xs:string" name="EntityId3"/>
+    <xs:element type="xs:string" name="EntityId4"/>
+    <xs:element type="xs:string" name="EntityId5"/>
     <xs:element name="Terms">
       <xs:complexType>
         <xs:sequence>
@@ -8675,10 +9228,34 @@
         </xs:sequence>
       </xs:complexType>
     </xs:element>
-    <xs:element name="TermName" type="xs:string"/>
-    <xs:element name="TermId" type="xs:string"/>
+    <xs:element type="xs:string" name="TermName"/>
+    <xs:element type="xs:string" name="TermId"/>
   </xs:schema>
 </ct:contentTypeSchema>
+</file>
+
+<file path=customXml/item3.xml><?xml version="1.0" encoding="utf-8"?>
+<?mso-contentType ?>
+<FormTemplates xmlns="http://schemas.microsoft.com/sharepoint/v3/contenttype/forms">
+  <Display>DocumentLibraryForm</Display>
+  <Edit>DocumentLibraryForm</Edit>
+  <New>DocumentLibraryForm</New>
+</FormTemplates>
+</file>
+
+<file path=customXml/item4.xml><?xml version="1.0" encoding="utf-8"?>
+<b:Sources xmlns:b="http://schemas.openxmlformats.org/officeDocument/2006/bibliography" xmlns="http://schemas.openxmlformats.org/officeDocument/2006/bibliography" Version="6" SelectedStyle="/APASixthEditionOfficeOnline.xsl" StyleName="APA"/>
+</file>
+
+<file path=customXml/item5.xml><?xml version="1.0" encoding="utf-8"?>
+<p:properties xmlns:pc="http://schemas.microsoft.com/office/infopath/2007/PartnerControls" xmlns:p="http://schemas.microsoft.com/office/2006/metadata/properties" xmlns:xsi="http://www.w3.org/2001/XMLSchema-instance">
+  <documentManagement>
+    <lcf76f155ced4ddcb4097134ff3c332f xmlns="eacbaa89-6f05-4783-8bdd-d7e016ae47e9">
+      <Terms xmlns="http://schemas.microsoft.com/office/infopath/2007/PartnerControls"/>
+    </lcf76f155ced4ddcb4097134ff3c332f>
+    <TaxCatchAll xmlns="f77844bf-a94f-4508-a9e5-085bc09476b6" xsi:nil="true"/>
+  </documentManagement>
+</p:properties>
 </file>
 
 <file path=customXml/itemProps1.xml><?xml version="1.0" encoding="utf-8"?>
@@ -8690,25 +9267,25 @@
 </file>
 
 <file path=customXml/itemProps2.xml><?xml version="1.0" encoding="utf-8"?>
-<ds:datastoreItem xmlns:ds="http://schemas.openxmlformats.org/officeDocument/2006/customXml" ds:itemID="{0C136B2B-E199-498D-83DD-D562F6F8F3E2}">
+<ds:datastoreItem xmlns:ds="http://schemas.openxmlformats.org/officeDocument/2006/customXml" ds:itemID="{E2AA9318-0E3B-47F2-9CCF-A1BEC250D3F9}">
   <ds:schemaRefs/>
 </ds:datastoreItem>
 </file>
 
 <file path=customXml/itemProps3.xml><?xml version="1.0" encoding="utf-8"?>
+<ds:datastoreItem xmlns:ds="http://schemas.openxmlformats.org/officeDocument/2006/customXml" ds:itemID="{1FD52C5B-DF5B-4F8B-B3F6-40D5376A2E0F}">
+  <ds:schemaRefs/>
+</ds:datastoreItem>
+</file>
+
+<file path=customXml/itemProps4.xml><?xml version="1.0" encoding="utf-8"?>
 <ds:datastoreItem xmlns:ds="http://schemas.openxmlformats.org/officeDocument/2006/customXml" ds:itemID="{01F3AA4F-BDDB-8143-A9DD-14E821F759AA}">
   <ds:schemaRefs/>
 </ds:datastoreItem>
 </file>
 
-<file path=customXml/itemProps4.xml><?xml version="1.0" encoding="utf-8"?>
-<ds:datastoreItem xmlns:ds="http://schemas.openxmlformats.org/officeDocument/2006/customXml" ds:itemID="{1FD52C5B-DF5B-4F8B-B3F6-40D5376A2E0F}">
-  <ds:schemaRefs/>
-</ds:datastoreItem>
-</file>
-
 <file path=customXml/itemProps5.xml><?xml version="1.0" encoding="utf-8"?>
-<ds:datastoreItem xmlns:ds="http://schemas.openxmlformats.org/officeDocument/2006/customXml" ds:itemID="{E2AA9318-0E3B-47F2-9CCF-A1BEC250D3F9}">
+<ds:datastoreItem xmlns:ds="http://schemas.openxmlformats.org/officeDocument/2006/customXml" ds:itemID="{0C136B2B-E199-498D-83DD-D562F6F8F3E2}">
   <ds:schemaRefs/>
 </ds:datastoreItem>
 </file>
</xml_diff>

<commit_message>
feat: add Enterprise PrivyID and Citizenship fields to SOW PrivyPass
</commit_message>
<xml_diff>
--- a/apps/sow-generator/backend/template_privypass.docx
+++ b/apps/sow-generator/backend/template_privypass.docx
@@ -2385,6 +2385,71 @@
           <w:p>
             <w:pPr>
               <w:pStyle w:val="21"/>
+              <w:spacing w:before="118" w:line="360" w:lineRule="auto"/>
+              <w:ind w:left="94"/>
+              <w:rPr>
+                <w:rFonts w:hint="default" w:ascii="Calibri" w:hAnsi="Calibri" w:cs="Calibri"/>
+                <w:b/>
+                <w:bCs/>
+                <w:sz w:val="24"/>
+                <w:szCs w:val="24"/>
+                <w:lang w:val="en-US"/>
+              </w:rPr>
+            </w:pPr>
+            <w:r>
+              <w:rPr>
+                <w:rFonts w:hint="default" w:ascii="Calibri" w:hAnsi="Calibri" w:cs="Calibri"/>
+                <w:b/>
+                <w:bCs/>
+                <w:sz w:val="24"/>
+                <w:szCs w:val="24"/>
+                <w:lang w:val="en-US"/>
+              </w:rPr>
+              <w:t>Enterprise PrivyID</w:t>
+            </w:r>
+          </w:p>
+        </w:tc>
+        <w:tc>
+          <w:tcPr>
+            <w:tcW w:w="6480" w:type="dxa"/>
+          </w:tcPr>
+          <w:p>
+            <w:pPr>
+              <w:pStyle w:val="21"/>
+              <w:spacing w:before="118" w:line="360" w:lineRule="auto"/>
+              <w:rPr>
+                <w:rFonts w:hint="default" w:asciiTheme="minorHAnsi" w:hAnsiTheme="minorHAnsi" w:eastAsiaTheme="minorEastAsia" w:cstheme="minorBidi"/>
+                <w:color w:val="001D35"/>
+                <w:sz w:val="24"/>
+                <w:szCs w:val="24"/>
+                <w:lang w:val="en-US"/>
+              </w:rPr>
+            </w:pPr>
+            <w:r>
+              <w:rPr>
+                <w:rFonts w:hint="default" w:asciiTheme="minorHAnsi" w:hAnsiTheme="minorHAnsi" w:eastAsiaTheme="minorEastAsia" w:cstheme="minorBidi"/>
+                <w:color w:val="001D35"/>
+                <w:sz w:val="24"/>
+                <w:szCs w:val="24"/>
+                <w:lang w:val="en-US"/>
+              </w:rPr>
+              <w:t>{{ enterprise_privyid }}</w:t>
+            </w:r>
+          </w:p>
+        </w:tc>
+      </w:tr>
+      <w:tr>
+        <w:trPr>
+          <w:trHeight w:val="300" w:hRule="atLeast"/>
+        </w:trPr>
+        <w:tc>
+          <w:tcPr>
+            <w:tcW w:w="2860" w:type="dxa"/>
+            <w:shd w:val="clear" w:color="auto" w:fill="CCCCCC"/>
+          </w:tcPr>
+          <w:p>
+            <w:pPr>
+              <w:pStyle w:val="21"/>
               <w:spacing w:before="102" w:line="360" w:lineRule="auto"/>
               <w:ind w:left="94"/>
               <w:rPr>
@@ -3195,7 +3260,7 @@
                 <w:szCs w:val="24"/>
                 <w:lang w:val="en-US"/>
               </w:rPr>
-              <w:t>Identifier</w:t>
+              <w:t>Citizenship</w:t>
             </w:r>
           </w:p>
         </w:tc>
@@ -3223,7 +3288,18 @@
                 <w:szCs w:val="24"/>
                 <w:lang w:val="en-US"/>
               </w:rPr>
-              <w:t xml:space="preserve"> {{ identifier }}</w:t>
+              <w:t xml:space="preserve"> {{ citizenship</w:t>
+            </w:r>
+            <w:bookmarkStart w:id="13" w:name="_GoBack"/>
+            <w:bookmarkEnd w:id="13"/>
+            <w:r>
+              <w:rPr>
+                <w:rFonts w:hint="default" w:ascii="Calibri" w:hAnsi="Calibri" w:cs="Calibri"/>
+                <w:sz w:val="24"/>
+                <w:szCs w:val="24"/>
+                <w:lang w:val="en-US"/>
+              </w:rPr>
+              <w:t xml:space="preserve"> }}</w:t>
             </w:r>
           </w:p>
         </w:tc>
@@ -3232,32 +3308,6 @@
             <w:tcW w:w="4101" w:type="dxa"/>
             <w:vAlign w:val="center"/>
           </w:tcPr>
-          <w:p>
-            <w:pPr>
-              <w:spacing w:line="360" w:lineRule="auto"/>
-              <w:ind w:left="138" w:right="119"/>
-              <w:jc w:val="left"/>
-              <w:rPr>
-                <w:rFonts w:hint="default" w:ascii="Calibri" w:hAnsi="Calibri" w:cs="Calibri"/>
-                <w:b w:val="0"/>
-                <w:bCs w:val="0"/>
-                <w:sz w:val="24"/>
-                <w:szCs w:val="24"/>
-                <w:lang w:val="en-US"/>
-              </w:rPr>
-            </w:pPr>
-            <w:r>
-              <w:rPr>
-                <w:rFonts w:hint="default" w:ascii="Calibri" w:hAnsi="Calibri" w:cs="Calibri"/>
-                <w:b w:val="0"/>
-                <w:bCs w:val="0"/>
-                <w:sz w:val="24"/>
-                <w:szCs w:val="24"/>
-                <w:lang w:val="en-US"/>
-              </w:rPr>
-              <w:t>First data identifier by user</w:t>
-            </w:r>
-          </w:p>
           <w:p>
             <w:pPr>
               <w:pStyle w:val="3"/>
@@ -3269,23 +3319,20 @@
               <w:ind w:right="119"/>
               <w:jc w:val="left"/>
               <w:rPr>
-                <w:rFonts w:ascii="Calibri" w:hAnsi="Calibri" w:cs="Calibri"/>
-                <w:b w:val="0"/>
-                <w:bCs w:val="0"/>
-                <w:sz w:val="24"/>
-                <w:szCs w:val="24"/>
-              </w:rPr>
-            </w:pPr>
-            <w:r>
-              <w:rPr>
                 <w:rFonts w:hint="default" w:ascii="Calibri" w:hAnsi="Calibri" w:cs="Calibri"/>
-                <w:b w:val="0"/>
-                <w:bCs w:val="0"/>
                 <w:sz w:val="24"/>
                 <w:szCs w:val="24"/>
                 <w:lang w:val="en-US"/>
               </w:rPr>
-              <w:t>Phone</w:t>
+            </w:pPr>
+            <w:r>
+              <w:rPr>
+                <w:rFonts w:hint="default" w:ascii="Calibri" w:hAnsi="Calibri" w:cs="Calibri"/>
+                <w:sz w:val="24"/>
+                <w:szCs w:val="24"/>
+                <w:lang w:val="en-US"/>
+              </w:rPr>
+              <w:t>WNI: Indonesian Citizen</w:t>
             </w:r>
           </w:p>
           <w:p>
@@ -3299,23 +3346,20 @@
               <w:ind w:right="119"/>
               <w:jc w:val="left"/>
               <w:rPr>
-                <w:rFonts w:ascii="Calibri" w:hAnsi="Calibri" w:cs="Calibri"/>
-                <w:b w:val="0"/>
-                <w:bCs w:val="0"/>
-                <w:sz w:val="24"/>
-                <w:szCs w:val="24"/>
-              </w:rPr>
-            </w:pPr>
-            <w:r>
-              <w:rPr>
                 <w:rFonts w:hint="default" w:ascii="Calibri" w:hAnsi="Calibri" w:cs="Calibri"/>
-                <w:b w:val="0"/>
-                <w:bCs w:val="0"/>
                 <w:sz w:val="24"/>
                 <w:szCs w:val="24"/>
                 <w:lang w:val="en-US"/>
               </w:rPr>
-              <w:t>PrivyID</w:t>
+            </w:pPr>
+            <w:r>
+              <w:rPr>
+                <w:rFonts w:hint="default" w:ascii="Calibri" w:hAnsi="Calibri" w:cs="Calibri"/>
+                <w:sz w:val="24"/>
+                <w:szCs w:val="24"/>
+                <w:lang w:val="en-US"/>
+              </w:rPr>
+              <w:t>WNA Permanent: Foreign national with permanent residency (requires Dukcapil verification)</w:t>
             </w:r>
           </w:p>
           <w:p>
@@ -3329,53 +3373,20 @@
               <w:ind w:right="119"/>
               <w:jc w:val="left"/>
               <w:rPr>
-                <w:rFonts w:ascii="Calibri" w:hAnsi="Calibri" w:cs="Calibri"/>
-                <w:b w:val="0"/>
-                <w:bCs w:val="0"/>
-                <w:sz w:val="24"/>
-                <w:szCs w:val="24"/>
-              </w:rPr>
-            </w:pPr>
-            <w:r>
-              <w:rPr>
                 <w:rFonts w:hint="default" w:ascii="Calibri" w:hAnsi="Calibri" w:cs="Calibri"/>
-                <w:b w:val="0"/>
-                <w:bCs w:val="0"/>
                 <w:sz w:val="24"/>
                 <w:szCs w:val="24"/>
                 <w:lang w:val="en-US"/>
               </w:rPr>
-              <w:t>NIK</w:t>
-            </w:r>
-          </w:p>
-          <w:p>
-            <w:pPr>
-              <w:pStyle w:val="3"/>
-              <w:numPr>
-                <w:ilvl w:val="0"/>
-                <w:numId w:val="2"/>
-              </w:numPr>
-              <w:spacing w:line="360" w:lineRule="auto"/>
-              <w:ind w:right="119"/>
-              <w:jc w:val="left"/>
-              <w:rPr>
-                <w:rFonts w:ascii="Calibri" w:hAnsi="Calibri" w:cs="Calibri"/>
-                <w:b w:val="0"/>
-                <w:bCs w:val="0"/>
-                <w:sz w:val="24"/>
-                <w:szCs w:val="24"/>
-              </w:rPr>
             </w:pPr>
             <w:r>
               <w:rPr>
                 <w:rFonts w:hint="default" w:ascii="Calibri" w:hAnsi="Calibri" w:cs="Calibri"/>
-                <w:b w:val="0"/>
-                <w:bCs w:val="0"/>
                 <w:sz w:val="24"/>
                 <w:szCs w:val="24"/>
                 <w:lang w:val="en-US"/>
               </w:rPr>
-              <w:t>Email</w:t>
+              <w:t>WNA Temporary: Foreign national with temporary residency (no Dukcapil verification)</w:t>
             </w:r>
           </w:p>
         </w:tc>
@@ -3410,7 +3421,7 @@
                 <w:szCs w:val="24"/>
                 <w:lang w:val="en-US"/>
               </w:rPr>
-              <w:t>SSO</w:t>
+              <w:t>Identifier</w:t>
             </w:r>
           </w:p>
         </w:tc>
@@ -3438,7 +3449,7 @@
                 <w:szCs w:val="24"/>
                 <w:lang w:val="en-US"/>
               </w:rPr>
-              <w:t xml:space="preserve"> {{ sso }}</w:t>
+              <w:t xml:space="preserve"> {{ identifier }}</w:t>
             </w:r>
           </w:p>
         </w:tc>
@@ -3470,7 +3481,7 @@
                 <w:szCs w:val="24"/>
                 <w:lang w:val="en-US"/>
               </w:rPr>
-              <w:t>Single Sign-On (SSO) behavior</w:t>
+              <w:t>First data identifier by user</w:t>
             </w:r>
           </w:p>
           <w:p>
@@ -3484,6 +3495,15 @@
               <w:ind w:right="119"/>
               <w:jc w:val="left"/>
               <w:rPr>
+                <w:rFonts w:ascii="Calibri" w:hAnsi="Calibri" w:cs="Calibri"/>
+                <w:b w:val="0"/>
+                <w:bCs w:val="0"/>
+                <w:sz w:val="24"/>
+                <w:szCs w:val="24"/>
+              </w:rPr>
+            </w:pPr>
+            <w:r>
+              <w:rPr>
                 <w:rFonts w:hint="default" w:ascii="Calibri" w:hAnsi="Calibri" w:cs="Calibri"/>
                 <w:b w:val="0"/>
                 <w:bCs w:val="0"/>
@@ -3491,6 +3511,26 @@
                 <w:szCs w:val="24"/>
                 <w:lang w:val="en-US"/>
               </w:rPr>
+              <w:t>Phone</w:t>
+            </w:r>
+          </w:p>
+          <w:p>
+            <w:pPr>
+              <w:pStyle w:val="3"/>
+              <w:numPr>
+                <w:ilvl w:val="0"/>
+                <w:numId w:val="2"/>
+              </w:numPr>
+              <w:spacing w:line="360" w:lineRule="auto"/>
+              <w:ind w:right="119"/>
+              <w:jc w:val="left"/>
+              <w:rPr>
+                <w:rFonts w:ascii="Calibri" w:hAnsi="Calibri" w:cs="Calibri"/>
+                <w:b w:val="0"/>
+                <w:bCs w:val="0"/>
+                <w:sz w:val="24"/>
+                <w:szCs w:val="24"/>
+              </w:rPr>
             </w:pPr>
             <w:r>
               <w:rPr>
@@ -3501,10 +3541,27 @@
                 <w:szCs w:val="24"/>
                 <w:lang w:val="en-US"/>
               </w:rPr>
-              <w:t>SSO Enabled: recurring transactions do not r</w:t>
-            </w:r>
-            <w:bookmarkStart w:id="13" w:name="_GoBack"/>
-            <w:bookmarkEnd w:id="13"/>
+              <w:t>PrivyID</w:t>
+            </w:r>
+          </w:p>
+          <w:p>
+            <w:pPr>
+              <w:pStyle w:val="3"/>
+              <w:numPr>
+                <w:ilvl w:val="0"/>
+                <w:numId w:val="2"/>
+              </w:numPr>
+              <w:spacing w:line="360" w:lineRule="auto"/>
+              <w:ind w:right="119"/>
+              <w:jc w:val="left"/>
+              <w:rPr>
+                <w:rFonts w:ascii="Calibri" w:hAnsi="Calibri" w:cs="Calibri"/>
+                <w:b w:val="0"/>
+                <w:bCs w:val="0"/>
+                <w:sz w:val="24"/>
+                <w:szCs w:val="24"/>
+              </w:rPr>
+            </w:pPr>
             <w:r>
               <w:rPr>
                 <w:rFonts w:hint="default" w:ascii="Calibri" w:hAnsi="Calibri" w:cs="Calibri"/>
@@ -3514,7 +3571,163 @@
                 <w:szCs w:val="24"/>
                 <w:lang w:val="en-US"/>
               </w:rPr>
-              <w:t>equire user consent for each transaction.</w:t>
+              <w:t>NIK</w:t>
+            </w:r>
+          </w:p>
+          <w:p>
+            <w:pPr>
+              <w:pStyle w:val="3"/>
+              <w:numPr>
+                <w:ilvl w:val="0"/>
+                <w:numId w:val="2"/>
+              </w:numPr>
+              <w:spacing w:line="360" w:lineRule="auto"/>
+              <w:ind w:right="119"/>
+              <w:jc w:val="left"/>
+              <w:rPr>
+                <w:rFonts w:ascii="Calibri" w:hAnsi="Calibri" w:cs="Calibri"/>
+                <w:b w:val="0"/>
+                <w:bCs w:val="0"/>
+                <w:sz w:val="24"/>
+                <w:szCs w:val="24"/>
+              </w:rPr>
+            </w:pPr>
+            <w:r>
+              <w:rPr>
+                <w:rFonts w:hint="default" w:ascii="Calibri" w:hAnsi="Calibri" w:cs="Calibri"/>
+                <w:b w:val="0"/>
+                <w:bCs w:val="0"/>
+                <w:sz w:val="24"/>
+                <w:szCs w:val="24"/>
+                <w:lang w:val="en-US"/>
+              </w:rPr>
+              <w:t>Email</w:t>
+            </w:r>
+          </w:p>
+        </w:tc>
+      </w:tr>
+      <w:tr>
+        <w:trPr>
+          <w:cantSplit/>
+          <w:trHeight w:val="859" w:hRule="atLeast"/>
+        </w:trPr>
+        <w:tc>
+          <w:tcPr>
+            <w:tcW w:w="2542" w:type="dxa"/>
+            <w:vAlign w:val="center"/>
+          </w:tcPr>
+          <w:p>
+            <w:pPr>
+              <w:pStyle w:val="21"/>
+              <w:spacing w:line="360" w:lineRule="auto"/>
+              <w:ind w:left="122"/>
+              <w:jc w:val="left"/>
+              <w:rPr>
+                <w:rFonts w:hint="default" w:ascii="Calibri" w:hAnsi="Calibri" w:cs="Calibri"/>
+                <w:sz w:val="24"/>
+                <w:szCs w:val="24"/>
+                <w:lang w:val="en-US"/>
+              </w:rPr>
+            </w:pPr>
+            <w:r>
+              <w:rPr>
+                <w:rFonts w:hint="default" w:ascii="Calibri" w:hAnsi="Calibri" w:cs="Calibri"/>
+                <w:sz w:val="24"/>
+                <w:szCs w:val="24"/>
+                <w:lang w:val="en-US"/>
+              </w:rPr>
+              <w:t>SSO</w:t>
+            </w:r>
+          </w:p>
+        </w:tc>
+        <w:tc>
+          <w:tcPr>
+            <w:tcW w:w="3260" w:type="dxa"/>
+            <w:vAlign w:val="center"/>
+          </w:tcPr>
+          <w:p>
+            <w:pPr>
+              <w:pStyle w:val="21"/>
+              <w:spacing w:line="360" w:lineRule="auto"/>
+              <w:jc w:val="left"/>
+              <w:rPr>
+                <w:rFonts w:hint="default" w:ascii="Calibri" w:hAnsi="Calibri" w:cs="Calibri"/>
+                <w:sz w:val="24"/>
+                <w:szCs w:val="24"/>
+                <w:lang w:val="en-US"/>
+              </w:rPr>
+            </w:pPr>
+            <w:r>
+              <w:rPr>
+                <w:rFonts w:hint="default" w:ascii="Calibri" w:hAnsi="Calibri" w:cs="Calibri"/>
+                <w:sz w:val="24"/>
+                <w:szCs w:val="24"/>
+                <w:lang w:val="en-US"/>
+              </w:rPr>
+              <w:t xml:space="preserve"> {{ sso }}</w:t>
+            </w:r>
+          </w:p>
+        </w:tc>
+        <w:tc>
+          <w:tcPr>
+            <w:tcW w:w="4101" w:type="dxa"/>
+            <w:vAlign w:val="center"/>
+          </w:tcPr>
+          <w:p>
+            <w:pPr>
+              <w:spacing w:line="360" w:lineRule="auto"/>
+              <w:ind w:left="138" w:right="119"/>
+              <w:jc w:val="left"/>
+              <w:rPr>
+                <w:rFonts w:hint="default" w:ascii="Calibri" w:hAnsi="Calibri" w:cs="Calibri"/>
+                <w:b w:val="0"/>
+                <w:bCs w:val="0"/>
+                <w:sz w:val="24"/>
+                <w:szCs w:val="24"/>
+                <w:lang w:val="en-US"/>
+              </w:rPr>
+            </w:pPr>
+            <w:r>
+              <w:rPr>
+                <w:rFonts w:hint="default" w:ascii="Calibri" w:hAnsi="Calibri" w:cs="Calibri"/>
+                <w:b w:val="0"/>
+                <w:bCs w:val="0"/>
+                <w:sz w:val="24"/>
+                <w:szCs w:val="24"/>
+                <w:lang w:val="en-US"/>
+              </w:rPr>
+              <w:t>Single Sign-On (SSO) behavior</w:t>
+            </w:r>
+          </w:p>
+          <w:p>
+            <w:pPr>
+              <w:pStyle w:val="3"/>
+              <w:numPr>
+                <w:ilvl w:val="0"/>
+                <w:numId w:val="2"/>
+              </w:numPr>
+              <w:spacing w:line="360" w:lineRule="auto"/>
+              <w:ind w:right="119"/>
+              <w:jc w:val="left"/>
+              <w:rPr>
+                <w:rFonts w:hint="default" w:ascii="Calibri" w:hAnsi="Calibri" w:cs="Calibri"/>
+                <w:b w:val="0"/>
+                <w:bCs w:val="0"/>
+                <w:sz w:val="24"/>
+                <w:szCs w:val="24"/>
+                <w:lang w:val="en-US"/>
+              </w:rPr>
+            </w:pPr>
+            <w:r>
+              <w:rPr>
+                <w:rFonts w:hint="default" w:ascii="Calibri" w:hAnsi="Calibri" w:cs="Calibri"/>
+                <w:b w:val="0"/>
+                <w:bCs w:val="0"/>
+                <w:sz w:val="24"/>
+                <w:szCs w:val="24"/>
+                <w:lang w:val="en-US"/>
+              </w:rPr>
+              <w:t>SSO Enabled: recurring transactions do not require user consent for each transaction.</w:t>
             </w:r>
           </w:p>
           <w:p>
@@ -8980,8 +9193,32 @@
 </file>
 
 <file path=customXml/item2.xml><?xml version="1.0" encoding="utf-8"?>
-<ct:contentTypeSchema xmlns:ct="http://schemas.microsoft.com/office/2006/metadata/contentType" xmlns:ma="http://schemas.microsoft.com/office/2006/metadata/properties/metaAttributes" ma:contentTypeVersion="18" ma:contentTypeID="0x010100A8015C8F28DCAC47983C9ECF64F44B7B" ma:versionID="aa240b6de93a5bca7900e5021e6f895a" ct:_="" ma:contentTypeScope="" ma:_="" ma:contentTypeDescription="Create a new document." ma:contentTypeName="Document">
-  <xsd:schema xmlns:ns2="eacbaa89-6f05-4783-8bdd-d7e016ae47e9" xmlns:ns3="f77844bf-a94f-4508-a9e5-085bc09476b6" xmlns:xsd="http://www.w3.org/2001/XMLSchema" xmlns:p="http://schemas.microsoft.com/office/2006/metadata/properties" xmlns:xs="http://www.w3.org/2001/XMLSchema" targetNamespace="http://schemas.microsoft.com/office/2006/metadata/properties" ns3:_="" ma:root="true" ma:fieldsID="aa8b4d4f7604ce7475ca58993237c145" ns2:_="">
+<p:properties xmlns:p="http://schemas.microsoft.com/office/2006/metadata/properties" xmlns:xsi="http://www.w3.org/2001/XMLSchema-instance" xmlns:pc="http://schemas.microsoft.com/office/infopath/2007/PartnerControls">
+  <documentManagement>
+    <lcf76f155ced4ddcb4097134ff3c332f xmlns="eacbaa89-6f05-4783-8bdd-d7e016ae47e9">
+      <Terms xmlns="http://schemas.microsoft.com/office/infopath/2007/PartnerControls"/>
+    </lcf76f155ced4ddcb4097134ff3c332f>
+    <TaxCatchAll xmlns="f77844bf-a94f-4508-a9e5-085bc09476b6" xsi:nil="true"/>
+  </documentManagement>
+</p:properties>
+</file>
+
+<file path=customXml/item3.xml><?xml version="1.0" encoding="utf-8"?>
+<b:Sources xmlns:b="http://schemas.openxmlformats.org/officeDocument/2006/bibliography" xmlns="http://schemas.openxmlformats.org/officeDocument/2006/bibliography" StyleName="APA" SelectedStyle="/APASixthEditionOfficeOnline.xsl" Version="6"/>
+</file>
+
+<file path=customXml/item4.xml><?xml version="1.0" encoding="utf-8"?>
+<?mso-contentType ?>
+<FormTemplates xmlns="http://schemas.microsoft.com/sharepoint/v3/contenttype/forms">
+  <Display>DocumentLibraryForm</Display>
+  <Edit>DocumentLibraryForm</Edit>
+  <New>DocumentLibraryForm</New>
+</FormTemplates>
+</file>
+
+<file path=customXml/item5.xml><?xml version="1.0" encoding="utf-8"?>
+<ct:contentTypeSchema xmlns:ct="http://schemas.microsoft.com/office/2006/metadata/contentType" xmlns:ma="http://schemas.microsoft.com/office/2006/metadata/properties/metaAttributes" ct:_="" ma:_="" ma:contentTypeName="Document" ma:versionID="aa240b6de93a5bca7900e5021e6f895a" ma:contentTypeID="0x010100A8015C8F28DCAC47983C9ECF64F44B7B" ma:contentTypeVersion="18" ma:contentTypeDescription="Create a new document." ma:contentTypeScope="">
+  <xsd:schema xmlns:p="http://schemas.microsoft.com/office/2006/metadata/properties" xmlns:ns2="eacbaa89-6f05-4783-8bdd-d7e016ae47e9" xmlns:ns3="f77844bf-a94f-4508-a9e5-085bc09476b6" xmlns:xs="http://www.w3.org/2001/XMLSchema" xmlns:xsd="http://www.w3.org/2001/XMLSchema" ns2:_="" ma:fieldsID="aa8b4d4f7604ce7475ca58993237c145" ma:root="true" ns3:_="" targetNamespace="http://schemas.microsoft.com/office/2006/metadata/properties">
     <xsd:import namespace="eacbaa89-6f05-4783-8bdd-d7e016ae47e9"/>
     <xsd:import namespace="f77844bf-a94f-4508-a9e5-085bc09476b6"/>
     <xsd:element name="properties">
@@ -9014,100 +9251,100 @@
       </xsd:complexType>
     </xsd:element>
   </xsd:schema>
-  <xsd:schema xmlns:xsd="http://www.w3.org/2001/XMLSchema" xmlns:pc="http://schemas.microsoft.com/office/infopath/2007/PartnerControls" xmlns:dms="http://schemas.microsoft.com/office/2006/documentManagement/types" xmlns:xs="http://www.w3.org/2001/XMLSchema" targetNamespace="eacbaa89-6f05-4783-8bdd-d7e016ae47e9" elementFormDefault="qualified">
+  <xsd:schema xmlns:xs="http://www.w3.org/2001/XMLSchema" xmlns:xsd="http://www.w3.org/2001/XMLSchema" xmlns:pc="http://schemas.microsoft.com/office/infopath/2007/PartnerControls" xmlns:dms="http://schemas.microsoft.com/office/2006/documentManagement/types" elementFormDefault="qualified" targetNamespace="eacbaa89-6f05-4783-8bdd-d7e016ae47e9">
     <xsd:import namespace="http://schemas.microsoft.com/office/2006/documentManagement/types"/>
     <xsd:import namespace="http://schemas.microsoft.com/office/infopath/2007/PartnerControls"/>
-    <xsd:element ma:hidden="true" nillable="true" name="MediaServiceMetadata" ma:index="8" ma:readOnly="true" ma:displayName="MediaServiceMetadata" ma:internalName="MediaServiceMetadata">
+    <xsd:element ma:index="8" ma:displayName="MediaServiceMetadata" ma:readOnly="true" ma:hidden="true" ma:internalName="MediaServiceMetadata" nillable="true" name="MediaServiceMetadata">
       <xsd:simpleType>
         <xsd:restriction base="dms:Note"/>
       </xsd:simpleType>
     </xsd:element>
-    <xsd:element ma:hidden="true" nillable="true" name="MediaServiceFastMetadata" ma:index="9" ma:readOnly="true" ma:displayName="MediaServiceFastMetadata" ma:internalName="MediaServiceFastMetadata">
+    <xsd:element ma:index="9" ma:displayName="MediaServiceFastMetadata" ma:readOnly="true" ma:hidden="true" ma:internalName="MediaServiceFastMetadata" nillable="true" name="MediaServiceFastMetadata">
       <xsd:simpleType>
         <xsd:restriction base="dms:Note"/>
       </xsd:simpleType>
     </xsd:element>
-    <xsd:element ma:hidden="true" nillable="true" name="MediaServiceAutoKeyPoints" ma:index="10" ma:readOnly="true" ma:displayName="MediaServiceAutoKeyPoints" ma:internalName="MediaServiceAutoKeyPoints">
+    <xsd:element ma:index="10" ma:displayName="MediaServiceAutoKeyPoints" ma:readOnly="true" ma:hidden="true" ma:internalName="MediaServiceAutoKeyPoints" nillable="true" name="MediaServiceAutoKeyPoints">
       <xsd:simpleType>
         <xsd:restriction base="dms:Note"/>
       </xsd:simpleType>
     </xsd:element>
-    <xsd:element nillable="true" name="MediaServiceKeyPoints" ma:index="11" ma:readOnly="true" ma:displayName="KeyPoints" ma:internalName="MediaServiceKeyPoints">
+    <xsd:element ma:index="11" ma:displayName="KeyPoints" ma:readOnly="true" ma:internalName="MediaServiceKeyPoints" nillable="true" name="MediaServiceKeyPoints">
       <xsd:simpleType>
         <xsd:restriction base="dms:Note">
           <xsd:maxLength value="255"/>
         </xsd:restriction>
       </xsd:simpleType>
     </xsd:element>
-    <xsd:element nillable="true" name="MediaServiceAutoTags" ma:index="12" ma:readOnly="true" ma:displayName="Tags" ma:internalName="MediaServiceAutoTags">
+    <xsd:element ma:index="12" ma:displayName="Tags" ma:readOnly="true" ma:internalName="MediaServiceAutoTags" nillable="true" name="MediaServiceAutoTags">
       <xsd:simpleType>
         <xsd:restriction base="dms:Text"/>
       </xsd:simpleType>
     </xsd:element>
-    <xsd:element nillable="true" name="MediaServiceOCR" ma:index="13" ma:readOnly="true" ma:displayName="Extracted Text" ma:internalName="MediaServiceOCR">
+    <xsd:element ma:index="13" ma:displayName="Extracted Text" ma:readOnly="true" ma:internalName="MediaServiceOCR" nillable="true" name="MediaServiceOCR">
       <xsd:simpleType>
         <xsd:restriction base="dms:Note">
           <xsd:maxLength value="255"/>
         </xsd:restriction>
       </xsd:simpleType>
     </xsd:element>
-    <xsd:element ma:hidden="true" nillable="true" name="MediaServiceGenerationTime" ma:index="14" ma:readOnly="true" ma:displayName="MediaServiceGenerationTime" ma:internalName="MediaServiceGenerationTime">
+    <xsd:element ma:index="14" ma:displayName="MediaServiceGenerationTime" ma:readOnly="true" ma:hidden="true" ma:internalName="MediaServiceGenerationTime" nillable="true" name="MediaServiceGenerationTime">
       <xsd:simpleType>
         <xsd:restriction base="dms:Text"/>
       </xsd:simpleType>
     </xsd:element>
-    <xsd:element ma:hidden="true" nillable="true" name="MediaServiceEventHashCode" ma:index="15" ma:readOnly="true" ma:displayName="MediaServiceEventHashCode" ma:internalName="MediaServiceEventHashCode">
+    <xsd:element ma:index="15" ma:displayName="MediaServiceEventHashCode" ma:readOnly="true" ma:hidden="true" ma:internalName="MediaServiceEventHashCode" nillable="true" name="MediaServiceEventHashCode">
       <xsd:simpleType>
         <xsd:restriction base="dms:Text"/>
       </xsd:simpleType>
     </xsd:element>
-    <xsd:element ma:hidden="true" nillable="true" name="MediaLengthInSeconds" ma:index="18" ma:readOnly="true" ma:displayName="MediaLengthInSeconds" ma:internalName="MediaLengthInSeconds">
+    <xsd:element ma:index="18" ma:displayName="MediaLengthInSeconds" ma:readOnly="true" ma:hidden="true" ma:internalName="MediaLengthInSeconds" nillable="true" name="MediaLengthInSeconds">
       <xsd:simpleType>
         <xsd:restriction base="dms:Unknown"/>
       </xsd:simpleType>
     </xsd:element>
-    <xsd:element ma:taxonomyFieldName="MediaServiceImageTags" nillable="true" ma:sspId="caa14961-3a97-4a50-88cd-37ec0b5dad00" ma:open="true" ma:taxonomyMulti="true" name="lcf76f155ced4ddcb4097134ff3c332f" ma:index="20" ma:isKeyword="false" ma:anchorId="fba54fb3-c3e1-fe81-a776-ca4b69148c4d" ma:fieldId="{5cf76f15-5ced-4ddc-b409-7134ff3c332f}" ma:readOnly="false" ma:termSetId="09814cd3-568e-fe90-9814-8d621ff8fb84" ma:displayName="Image Tags" ma:taxonomy="true" ma:internalName="lcf76f155ced4ddcb4097134ff3c332f">
+    <xsd:element ma:index="20" ma:open="true" ma:taxonomyFieldName="MediaServiceImageTags" ma:anchorId="fba54fb3-c3e1-fe81-a776-ca4b69148c4d" ma:displayName="Image Tags" ma:readOnly="false" ma:isKeyword="false" ma:taxonomy="true" ma:internalName="lcf76f155ced4ddcb4097134ff3c332f" ma:taxonomyMulti="true" ma:termSetId="09814cd3-568e-fe90-9814-8d621ff8fb84" ma:fieldId="{5cf76f15-5ced-4ddc-b409-7134ff3c332f}" nillable="true" ma:sspId="caa14961-3a97-4a50-88cd-37ec0b5dad00" name="lcf76f155ced4ddcb4097134ff3c332f">
       <xsd:complexType>
         <xsd:sequence>
           <xsd:element maxOccurs="1" minOccurs="0" ref="pc:Terms"/>
         </xsd:sequence>
       </xsd:complexType>
     </xsd:element>
-    <xsd:element ma:hidden="true" nillable="true" name="MediaServiceObjectDetectorVersions" ma:index="22" ma:readOnly="true" ma:indexed="true" ma:displayName="MediaServiceObjectDetectorVersions" ma:internalName="MediaServiceObjectDetectorVersions">
+    <xsd:element ma:index="22" ma:displayName="MediaServiceObjectDetectorVersions" ma:readOnly="true" ma:hidden="true" ma:internalName="MediaServiceObjectDetectorVersions" nillable="true" ma:indexed="true" name="MediaServiceObjectDetectorVersions">
       <xsd:simpleType>
         <xsd:restriction base="dms:Text"/>
       </xsd:simpleType>
     </xsd:element>
-    <xsd:element ma:hidden="true" nillable="true" name="MediaServiceDateTaken" ma:index="23" ma:readOnly="true" ma:indexed="true" ma:displayName="MediaServiceDateTaken" ma:internalName="MediaServiceDateTaken">
+    <xsd:element ma:index="23" ma:displayName="MediaServiceDateTaken" ma:readOnly="true" ma:hidden="true" ma:internalName="MediaServiceDateTaken" nillable="true" ma:indexed="true" name="MediaServiceDateTaken">
       <xsd:simpleType>
         <xsd:restriction base="dms:Text"/>
       </xsd:simpleType>
     </xsd:element>
-    <xsd:element ma:hidden="true" nillable="true" name="MediaServiceSearchProperties" ma:index="24" ma:readOnly="true" ma:displayName="MediaServiceSearchProperties" ma:internalName="MediaServiceSearchProperties">
+    <xsd:element ma:index="24" ma:displayName="MediaServiceSearchProperties" ma:readOnly="true" ma:hidden="true" ma:internalName="MediaServiceSearchProperties" nillable="true" name="MediaServiceSearchProperties">
       <xsd:simpleType>
         <xsd:restriction base="dms:Note"/>
       </xsd:simpleType>
     </xsd:element>
-    <xsd:element ma:hidden="true" nillable="true" name="MediaServiceBillingMetadata" ma:index="25" ma:readOnly="true" ma:displayName="MediaServiceBillingMetadata" ma:internalName="MediaServiceBillingMetadata">
+    <xsd:element ma:index="25" ma:displayName="MediaServiceBillingMetadata" ma:readOnly="true" ma:hidden="true" ma:internalName="MediaServiceBillingMetadata" nillable="true" name="MediaServiceBillingMetadata">
       <xsd:simpleType>
         <xsd:restriction base="dms:Note"/>
       </xsd:simpleType>
     </xsd:element>
   </xsd:schema>
-  <xsd:schema xmlns:xsd="http://www.w3.org/2001/XMLSchema" xmlns:pc="http://schemas.microsoft.com/office/infopath/2007/PartnerControls" xmlns:dms="http://schemas.microsoft.com/office/2006/documentManagement/types" xmlns:xs="http://www.w3.org/2001/XMLSchema" targetNamespace="f77844bf-a94f-4508-a9e5-085bc09476b6" elementFormDefault="qualified">
+  <xsd:schema xmlns:xs="http://www.w3.org/2001/XMLSchema" xmlns:xsd="http://www.w3.org/2001/XMLSchema" xmlns:pc="http://schemas.microsoft.com/office/infopath/2007/PartnerControls" xmlns:dms="http://schemas.microsoft.com/office/2006/documentManagement/types" elementFormDefault="qualified" targetNamespace="f77844bf-a94f-4508-a9e5-085bc09476b6">
     <xsd:import namespace="http://schemas.microsoft.com/office/2006/documentManagement/types"/>
     <xsd:import namespace="http://schemas.microsoft.com/office/infopath/2007/PartnerControls"/>
-    <xsd:element nillable="true" name="SharedWithUsers" ma:index="16" ma:readOnly="true" ma:displayName="Shared With" ma:internalName="SharedWithUsers">
+    <xsd:element ma:index="16" ma:displayName="Shared With" ma:readOnly="true" ma:internalName="SharedWithUsers" nillable="true" name="SharedWithUsers">
       <xsd:complexType>
         <xsd:complexContent>
           <xsd:extension base="dms:UserMulti">
             <xsd:sequence>
-              <xsd:element maxOccurs="unbounded" name="UserInfo" minOccurs="0">
+              <xsd:element maxOccurs="unbounded" minOccurs="0" name="UserInfo">
                 <xsd:complexType>
                   <xsd:sequence>
-                    <xsd:element type="xsd:string" name="DisplayName" minOccurs="0"/>
-                    <xsd:element type="dms:UserId" nillable="true" name="AccountId" minOccurs="0"/>
-                    <xsd:element type="xsd:string" name="AccountType" minOccurs="0"/>
+                    <xsd:element type="xsd:string" minOccurs="0" name="DisplayName"/>
+                    <xsd:element type="dms:UserId" nillable="true" minOccurs="0" name="AccountId"/>
+                    <xsd:element type="xsd:string" minOccurs="0" name="AccountType"/>
                   </xsd:sequence>
                 </xsd:complexType>
               </xsd:element>
@@ -9116,56 +9353,56 @@
         </xsd:complexContent>
       </xsd:complexType>
     </xsd:element>
-    <xsd:element nillable="true" name="SharedWithDetails" ma:index="17" ma:readOnly="true" ma:displayName="Shared With Details" ma:internalName="SharedWithDetails">
+    <xsd:element ma:index="17" ma:displayName="Shared With Details" ma:readOnly="true" ma:internalName="SharedWithDetails" nillable="true" name="SharedWithDetails">
       <xsd:simpleType>
         <xsd:restriction base="dms:Note">
           <xsd:maxLength value="255"/>
         </xsd:restriction>
       </xsd:simpleType>
     </xsd:element>
-    <xsd:element ma:web="f77844bf-a94f-4508-a9e5-085bc09476b6" ma:hidden="true" nillable="true" ma:list="{57524694-6724-4ff2-8734-e6dfacb36b6e}" ma:showField="CatchAllData" name="TaxCatchAll" ma:index="21" ma:displayName="Taxonomy Catch All Column" ma:internalName="TaxCatchAll">
+    <xsd:element ma:index="21" ma:list="{57524694-6724-4ff2-8734-e6dfacb36b6e}" ma:displayName="Taxonomy Catch All Column" ma:showField="CatchAllData" ma:hidden="true" ma:web="f77844bf-a94f-4508-a9e5-085bc09476b6" ma:internalName="TaxCatchAll" nillable="true" name="TaxCatchAll">
       <xsd:complexType>
         <xsd:complexContent>
           <xsd:extension base="dms:MultiChoiceLookup">
             <xsd:sequence>
-              <xsd:element type="dms:Lookup" nillable="true" maxOccurs="unbounded" name="Value" minOccurs="0"/>
+              <xsd:element type="dms:Lookup" maxOccurs="unbounded" nillable="true" minOccurs="0" name="Value"/>
             </xsd:sequence>
           </xsd:extension>
         </xsd:complexContent>
       </xsd:complexType>
     </xsd:element>
   </xsd:schema>
-  <xsd:schema xmlns:xsd="http://www.w3.org/2001/XMLSchema" xmlns:dc="http://purl.org/dc/elements/1.1/" xmlns:xsi="http://www.w3.org/2001/XMLSchema-instance" xmlns:odoc="http://schemas.microsoft.com/internal/obd" xmlns="http://schemas.openxmlformats.org/package/2006/metadata/core-properties" xmlns:dcterms="http://purl.org/dc/terms/" targetNamespace="http://schemas.openxmlformats.org/package/2006/metadata/core-properties" blockDefault="#all" attributeFormDefault="unqualified" elementFormDefault="qualified">
-    <xsd:import namespace="http://purl.org/dc/elements/1.1/" schemaLocation="http://dublincore.org/schemas/xmls/qdc/2003/04/02/dc.xsd"/>
-    <xsd:import namespace="http://purl.org/dc/terms/" schemaLocation="http://dublincore.org/schemas/xmls/qdc/2003/04/02/dcterms.xsd"/>
+  <xsd:schema xmlns:dcterms="http://purl.org/dc/terms/" xmlns:dc="http://purl.org/dc/elements/1.1/" xmlns:xsd="http://www.w3.org/2001/XMLSchema" xmlns:xsi="http://www.w3.org/2001/XMLSchema-instance" xmlns="http://schemas.openxmlformats.org/package/2006/metadata/core-properties" xmlns:odoc="http://schemas.microsoft.com/internal/obd" attributeFormDefault="unqualified" elementFormDefault="qualified" blockDefault="#all" targetNamespace="http://schemas.openxmlformats.org/package/2006/metadata/core-properties">
+    <xsd:import schemaLocation="http://dublincore.org/schemas/xmls/qdc/2003/04/02/dc.xsd" namespace="http://purl.org/dc/elements/1.1/"/>
+    <xsd:import schemaLocation="http://dublincore.org/schemas/xmls/qdc/2003/04/02/dcterms.xsd" namespace="http://purl.org/dc/terms/"/>
     <xsd:element type="CT_coreProperties" name="coreProperties"/>
     <xsd:complexType name="CT_coreProperties">
       <xsd:all>
         <xsd:element maxOccurs="1" minOccurs="0" ref="dc:creator"/>
         <xsd:element maxOccurs="1" minOccurs="0" ref="dcterms:created"/>
         <xsd:element maxOccurs="1" minOccurs="0" ref="dc:identifier"/>
-        <xsd:element type="xsd:string" maxOccurs="1" name="contentType" ma:index="0" minOccurs="0" ma:displayName="Content Type"/>
-        <xsd:element maxOccurs="1" ma:index="4" minOccurs="0" ma:displayName="Title" ref="dc:title"/>
+        <xsd:element ma:index="0" ma:displayName="Content Type" type="xsd:string" maxOccurs="1" minOccurs="0" name="contentType"/>
+        <xsd:element ma:index="4" ma:displayName="Title" maxOccurs="1" minOccurs="0" ref="dc:title"/>
         <xsd:element maxOccurs="1" minOccurs="0" ref="dc:subject"/>
         <xsd:element maxOccurs="1" minOccurs="0" ref="dc:description"/>
-        <xsd:element type="xsd:string" maxOccurs="1" name="keywords" minOccurs="0"/>
+        <xsd:element type="xsd:string" maxOccurs="1" minOccurs="0" name="keywords"/>
         <xsd:element maxOccurs="1" minOccurs="0" ref="dc:language"/>
-        <xsd:element type="xsd:string" maxOccurs="1" name="category" minOccurs="0"/>
-        <xsd:element type="xsd:string" maxOccurs="1" name="version" minOccurs="0"/>
-        <xsd:element type="xsd:string" maxOccurs="1" name="revision" minOccurs="0">
+        <xsd:element type="xsd:string" maxOccurs="1" minOccurs="0" name="category"/>
+        <xsd:element type="xsd:string" maxOccurs="1" minOccurs="0" name="version"/>
+        <xsd:element type="xsd:string" maxOccurs="1" minOccurs="0" name="revision">
           <xsd:annotation>
             <xsd:documentation>
                         This value indicates the number of saves or revisions. The application is responsible for updating this value after each revision.
                     </xsd:documentation>
           </xsd:annotation>
         </xsd:element>
-        <xsd:element type="xsd:string" maxOccurs="1" name="lastModifiedBy" minOccurs="0"/>
+        <xsd:element type="xsd:string" maxOccurs="1" minOccurs="0" name="lastModifiedBy"/>
         <xsd:element maxOccurs="1" minOccurs="0" ref="dcterms:modified"/>
-        <xsd:element type="xsd:string" maxOccurs="1" name="contentStatus" minOccurs="0"/>
+        <xsd:element type="xsd:string" maxOccurs="1" minOccurs="0" name="contentStatus"/>
       </xsd:all>
     </xsd:complexType>
   </xsd:schema>
-  <xs:schema xmlns:pc="http://schemas.microsoft.com/office/infopath/2007/PartnerControls" xmlns:xs="http://www.w3.org/2001/XMLSchema" targetNamespace="http://schemas.microsoft.com/office/infopath/2007/PartnerControls" attributeFormDefault="unqualified" elementFormDefault="qualified">
+  <xs:schema xmlns:xs="http://www.w3.org/2001/XMLSchema" xmlns:pc="http://schemas.microsoft.com/office/infopath/2007/PartnerControls" attributeFormDefault="unqualified" elementFormDefault="qualified" targetNamespace="http://schemas.microsoft.com/office/infopath/2007/PartnerControls">
     <xs:element name="Person">
       <xs:complexType>
         <xs:sequence>
@@ -9234,30 +9471,6 @@
 </ct:contentTypeSchema>
 </file>
 
-<file path=customXml/item3.xml><?xml version="1.0" encoding="utf-8"?>
-<?mso-contentType ?>
-<FormTemplates xmlns="http://schemas.microsoft.com/sharepoint/v3/contenttype/forms">
-  <Display>DocumentLibraryForm</Display>
-  <Edit>DocumentLibraryForm</Edit>
-  <New>DocumentLibraryForm</New>
-</FormTemplates>
-</file>
-
-<file path=customXml/item4.xml><?xml version="1.0" encoding="utf-8"?>
-<b:Sources xmlns:b="http://schemas.openxmlformats.org/officeDocument/2006/bibliography" xmlns="http://schemas.openxmlformats.org/officeDocument/2006/bibliography" Version="6" SelectedStyle="/APASixthEditionOfficeOnline.xsl" StyleName="APA"/>
-</file>
-
-<file path=customXml/item5.xml><?xml version="1.0" encoding="utf-8"?>
-<p:properties xmlns:pc="http://schemas.microsoft.com/office/infopath/2007/PartnerControls" xmlns:p="http://schemas.microsoft.com/office/2006/metadata/properties" xmlns:xsi="http://www.w3.org/2001/XMLSchema-instance">
-  <documentManagement>
-    <lcf76f155ced4ddcb4097134ff3c332f xmlns="eacbaa89-6f05-4783-8bdd-d7e016ae47e9">
-      <Terms xmlns="http://schemas.microsoft.com/office/infopath/2007/PartnerControls"/>
-    </lcf76f155ced4ddcb4097134ff3c332f>
-    <TaxCatchAll xmlns="f77844bf-a94f-4508-a9e5-085bc09476b6" xsi:nil="true"/>
-  </documentManagement>
-</p:properties>
-</file>
-
 <file path=customXml/itemProps1.xml><?xml version="1.0" encoding="utf-8"?>
 <ds:datastoreItem xmlns:ds="http://schemas.openxmlformats.org/officeDocument/2006/customXml" ds:itemID="{B1977F7D-205B-4081-913C-38D41E755F92}">
   <ds:schemaRefs>
@@ -9267,25 +9480,25 @@
 </file>
 
 <file path=customXml/itemProps2.xml><?xml version="1.0" encoding="utf-8"?>
-<ds:datastoreItem xmlns:ds="http://schemas.openxmlformats.org/officeDocument/2006/customXml" ds:itemID="{E2AA9318-0E3B-47F2-9CCF-A1BEC250D3F9}">
+<ds:datastoreItem xmlns:ds="http://schemas.openxmlformats.org/officeDocument/2006/customXml" ds:itemID="{0C136B2B-E199-498D-83DD-D562F6F8F3E2}">
   <ds:schemaRefs/>
 </ds:datastoreItem>
 </file>
 
 <file path=customXml/itemProps3.xml><?xml version="1.0" encoding="utf-8"?>
+<ds:datastoreItem xmlns:ds="http://schemas.openxmlformats.org/officeDocument/2006/customXml" ds:itemID="{01F3AA4F-BDDB-8143-A9DD-14E821F759AA}">
+  <ds:schemaRefs/>
+</ds:datastoreItem>
+</file>
+
+<file path=customXml/itemProps4.xml><?xml version="1.0" encoding="utf-8"?>
 <ds:datastoreItem xmlns:ds="http://schemas.openxmlformats.org/officeDocument/2006/customXml" ds:itemID="{1FD52C5B-DF5B-4F8B-B3F6-40D5376A2E0F}">
   <ds:schemaRefs/>
 </ds:datastoreItem>
 </file>
 
-<file path=customXml/itemProps4.xml><?xml version="1.0" encoding="utf-8"?>
-<ds:datastoreItem xmlns:ds="http://schemas.openxmlformats.org/officeDocument/2006/customXml" ds:itemID="{01F3AA4F-BDDB-8143-A9DD-14E821F759AA}">
-  <ds:schemaRefs/>
-</ds:datastoreItem>
-</file>
-
 <file path=customXml/itemProps5.xml><?xml version="1.0" encoding="utf-8"?>
-<ds:datastoreItem xmlns:ds="http://schemas.openxmlformats.org/officeDocument/2006/customXml" ds:itemID="{0C136B2B-E199-498D-83DD-D562F6F8F3E2}">
+<ds:datastoreItem xmlns:ds="http://schemas.openxmlformats.org/officeDocument/2006/customXml" ds:itemID="{E2AA9318-0E3B-47F2-9CCF-A1BEC250D3F9}">
   <ds:schemaRefs/>
 </ds:datastoreItem>
 </file>
</xml_diff>